<commit_message>
aset P11 dipindahkan apa adanya
</commit_message>
<xml_diff>
--- a/12. Worksheet_PABW_Pertemuan12 - ID (revisi sinkron).docx
+++ b/12. Worksheet_PABW_Pertemuan12 - ID (revisi sinkron).docx
@@ -126,87 +126,7 @@
           <w:color w:val="5A6080"/>
           <w:sz w:val="18"/>
         </w:rPr>
-        <w:t xml:space="preserve">Pengembangan </w:t>
-      </w:r>
-      <w:proofErr w:type="spellStart"/>
-      <w:r>
-        <w:rPr>
-          <w:rFonts w:cs="Carlito"/>
-          <w:i/>
-          <w:color w:val="5A6080"/>
-          <w:sz w:val="18"/>
-        </w:rPr>
-        <w:t>Aplikasi</w:t>
-      </w:r>
-      <w:proofErr w:type="spellEnd"/>
-      <w:r>
-        <w:rPr>
-          <w:rFonts w:cs="Carlito"/>
-          <w:i/>
-          <w:color w:val="5A6080"/>
-          <w:sz w:val="18"/>
-        </w:rPr>
-        <w:t xml:space="preserve"> </w:t>
-      </w:r>
-      <w:proofErr w:type="spellStart"/>
-      <w:r>
-        <w:rPr>
-          <w:rFonts w:cs="Carlito"/>
-          <w:i/>
-          <w:color w:val="5A6080"/>
-          <w:sz w:val="18"/>
-        </w:rPr>
-        <w:t>Berbasis</w:t>
-      </w:r>
-      <w:proofErr w:type="spellEnd"/>
-      <w:r>
-        <w:rPr>
-          <w:rFonts w:cs="Carlito"/>
-          <w:i/>
-          <w:color w:val="5A6080"/>
-          <w:sz w:val="18"/>
-        </w:rPr>
-        <w:t xml:space="preserve"> </w:t>
-      </w:r>
-      <w:proofErr w:type="gramStart"/>
-      <w:r>
-        <w:rPr>
-          <w:rFonts w:cs="Carlito"/>
-          <w:i/>
-          <w:color w:val="5A6080"/>
-          <w:sz w:val="18"/>
-        </w:rPr>
-        <w:t>Web  ·</w:t>
-      </w:r>
-      <w:proofErr w:type="gramEnd"/>
-      <w:r>
-        <w:rPr>
-          <w:rFonts w:cs="Carlito"/>
-          <w:i/>
-          <w:color w:val="5A6080"/>
-          <w:sz w:val="18"/>
-        </w:rPr>
-        <w:t xml:space="preserve">  SIF</w:t>
-      </w:r>
-      <w:proofErr w:type="gramStart"/>
-      <w:r>
-        <w:rPr>
-          <w:rFonts w:cs="Carlito"/>
-          <w:i/>
-          <w:color w:val="5A6080"/>
-          <w:sz w:val="18"/>
-        </w:rPr>
-        <w:t>302  ·</w:t>
-      </w:r>
-      <w:proofErr w:type="gramEnd"/>
-      <w:r>
-        <w:rPr>
-          <w:rFonts w:cs="Carlito"/>
-          <w:i/>
-          <w:color w:val="5A6080"/>
-          <w:sz w:val="18"/>
-        </w:rPr>
-        <w:t xml:space="preserve">  Semester Gasal 2026/2027</w:t>
+        <w:t>Pengembangan Aplikasi Berbasis Web  ·  SIF302  ·  Semester Gasal 2026/2027</w:t>
       </w:r>
     </w:p>
     <w:tbl>
@@ -499,7 +419,6 @@
             <w:pPr>
               <w:spacing w:before="20" w:after="20"/>
             </w:pPr>
-            <w:proofErr w:type="spellStart"/>
             <w:r>
               <w:rPr>
                 <w:rFonts w:cs="Carlito"/>
@@ -507,29 +426,8 @@
                 <w:color w:val="FFFFFF"/>
                 <w:sz w:val="19"/>
               </w:rPr>
-              <w:t>Capaian</w:t>
-            </w:r>
-            <w:proofErr w:type="spellEnd"/>
-            <w:r>
-              <w:rPr>
-                <w:rFonts w:cs="Carlito"/>
-                <w:b/>
-                <w:color w:val="FFFFFF"/>
-                <w:sz w:val="19"/>
-              </w:rPr>
-              <w:t xml:space="preserve"> </w:t>
-            </w:r>
-            <w:proofErr w:type="spellStart"/>
-            <w:r>
-              <w:rPr>
-                <w:rFonts w:cs="Carlito"/>
-                <w:b/>
-                <w:color w:val="FFFFFF"/>
-                <w:sz w:val="19"/>
-              </w:rPr>
-              <w:t>pembelajaran</w:t>
-            </w:r>
-            <w:proofErr w:type="spellEnd"/>
+              <w:t>Capaian pembelajaran</w:t>
+            </w:r>
           </w:p>
         </w:tc>
         <w:tc>
@@ -1308,65 +1206,8 @@
                 <w:rFonts w:cs="Carlito"/>
                 <w:sz w:val="18"/>
               </w:rPr>
-              <w:t xml:space="preserve">Dua </w:t>
-            </w:r>
-            <w:proofErr w:type="spellStart"/>
-            <w:r>
-              <w:rPr>
-                <w:rFonts w:cs="Carlito"/>
-                <w:sz w:val="18"/>
-              </w:rPr>
-              <w:t>perintah</w:t>
-            </w:r>
-            <w:proofErr w:type="spellEnd"/>
-            <w:r>
-              <w:rPr>
-                <w:rFonts w:cs="Carlito"/>
-                <w:sz w:val="18"/>
-              </w:rPr>
-              <w:t xml:space="preserve"> </w:t>
-            </w:r>
-            <w:proofErr w:type="spellStart"/>
-            <w:r>
-              <w:rPr>
-                <w:rFonts w:cs="Carlito"/>
-                <w:sz w:val="18"/>
-              </w:rPr>
-              <w:t>berjalan</w:t>
-            </w:r>
-            <w:proofErr w:type="spellEnd"/>
-            <w:r>
-              <w:rPr>
-                <w:rFonts w:cs="Carlito"/>
-                <w:sz w:val="18"/>
-              </w:rPr>
-              <w:t xml:space="preserve">, </w:t>
-            </w:r>
-            <w:proofErr w:type="spellStart"/>
-            <w:r>
-              <w:rPr>
-                <w:rFonts w:cs="Carlito"/>
-                <w:sz w:val="18"/>
-              </w:rPr>
-              <w:t>versi</w:t>
-            </w:r>
-            <w:proofErr w:type="spellEnd"/>
-            <w:r>
-              <w:rPr>
-                <w:rFonts w:cs="Carlito"/>
-                <w:sz w:val="18"/>
-              </w:rPr>
-              <w:t xml:space="preserve"> </w:t>
-            </w:r>
-            <w:proofErr w:type="spellStart"/>
-            <w:r>
-              <w:rPr>
-                <w:rFonts w:cs="Carlito"/>
-                <w:sz w:val="18"/>
-              </w:rPr>
-              <w:t>tercatat</w:t>
-            </w:r>
-            <w:proofErr w:type="spellEnd"/>
+              <w:t>Dua perintah berjalan, versi tercatat</w:t>
+            </w:r>
           </w:p>
         </w:tc>
       </w:tr>
@@ -2228,59 +2069,13 @@
         <w:keepNext/>
         <w:spacing w:before="160" w:after="60"/>
       </w:pPr>
-      <w:proofErr w:type="gramStart"/>
       <w:r>
         <w:rPr>
           <w:rFonts w:cs="Carlito"/>
           <w:b/>
           <w:color w:val="003796"/>
         </w:rPr>
-        <w:t>A.1  Dua</w:t>
-      </w:r>
-      <w:proofErr w:type="gramEnd"/>
-      <w:r>
-        <w:rPr>
-          <w:rFonts w:cs="Carlito"/>
-          <w:b/>
-          <w:color w:val="003796"/>
-        </w:rPr>
-        <w:t xml:space="preserve"> </w:t>
-      </w:r>
-      <w:proofErr w:type="spellStart"/>
-      <w:r>
-        <w:rPr>
-          <w:rFonts w:cs="Carlito"/>
-          <w:b/>
-          <w:color w:val="003796"/>
-        </w:rPr>
-        <w:t>perintah</w:t>
-      </w:r>
-      <w:proofErr w:type="spellEnd"/>
-      <w:r>
-        <w:rPr>
-          <w:rFonts w:cs="Carlito"/>
-          <w:b/>
-          <w:color w:val="003796"/>
-        </w:rPr>
-        <w:t xml:space="preserve"> yang harus </w:t>
-      </w:r>
-      <w:proofErr w:type="spellStart"/>
-      <w:r>
-        <w:rPr>
-          <w:rFonts w:cs="Carlito"/>
-          <w:b/>
-          <w:color w:val="003796"/>
-        </w:rPr>
-        <w:t>dijawab</w:t>
-      </w:r>
-      <w:proofErr w:type="spellEnd"/>
-      <w:r>
-        <w:rPr>
-          <w:rFonts w:cs="Carlito"/>
-          <w:b/>
-          <w:color w:val="003796"/>
-        </w:rPr>
-        <w:t xml:space="preserve"> terminal</w:t>
+        <w:t>A.1  Dua perintah yang harus dijawab terminal</w:t>
       </w:r>
     </w:p>
     <w:p>
@@ -2337,23 +2132,13 @@
             <w:r>
               <w:br/>
             </w:r>
-            <w:proofErr w:type="spellStart"/>
             <w:r>
               <w:rPr>
                 <w:rFonts w:ascii="DejaVu Sans Mono" w:eastAsia="DejaVu Sans Mono" w:hAnsi="DejaVu Sans Mono" w:cs="DejaVu Sans Mono"/>
                 <w:color w:val="E2E8F0"/>
                 <w:sz w:val="17"/>
               </w:rPr>
-              <w:t>npm</w:t>
-            </w:r>
-            <w:proofErr w:type="spellEnd"/>
-            <w:r>
-              <w:rPr>
-                <w:rFonts w:ascii="DejaVu Sans Mono" w:eastAsia="DejaVu Sans Mono" w:hAnsi="DejaVu Sans Mono" w:cs="DejaVu Sans Mono"/>
-                <w:color w:val="E2E8F0"/>
-                <w:sz w:val="17"/>
-              </w:rPr>
-              <w:t xml:space="preserve"> -v</w:t>
+              <w:t>npm -v</w:t>
             </w:r>
           </w:p>
         </w:tc>
@@ -2789,7 +2574,6 @@
             <w:pPr>
               <w:spacing w:before="20" w:after="20"/>
             </w:pPr>
-            <w:proofErr w:type="spellStart"/>
             <w:r>
               <w:rPr>
                 <w:rFonts w:cs="Carlito"/>
@@ -2799,7 +2583,6 @@
               </w:rPr>
               <w:t>Berkas</w:t>
             </w:r>
-            <w:proofErr w:type="spellEnd"/>
           </w:p>
         </w:tc>
         <w:tc>
@@ -3207,44 +2990,14 @@
         <w:keepNext/>
         <w:spacing w:before="160" w:after="60"/>
       </w:pPr>
-      <w:proofErr w:type="gramStart"/>
       <w:r>
         <w:rPr>
           <w:rFonts w:cs="Carlito"/>
           <w:b/>
           <w:color w:val="003796"/>
         </w:rPr>
-        <w:t xml:space="preserve">A.3  </w:t>
+        <w:t>A.3  Periksa folder kerja</w:t>
       </w:r>
-      <w:proofErr w:type="spellStart"/>
-      <w:r>
-        <w:rPr>
-          <w:rFonts w:cs="Carlito"/>
-          <w:b/>
-          <w:color w:val="003796"/>
-        </w:rPr>
-        <w:t>Periksa</w:t>
-      </w:r>
-      <w:proofErr w:type="spellEnd"/>
-      <w:proofErr w:type="gramEnd"/>
-      <w:r>
-        <w:rPr>
-          <w:rFonts w:cs="Carlito"/>
-          <w:b/>
-          <w:color w:val="003796"/>
-        </w:rPr>
-        <w:t xml:space="preserve"> folder </w:t>
-      </w:r>
-      <w:proofErr w:type="spellStart"/>
-      <w:r>
-        <w:rPr>
-          <w:rFonts w:cs="Carlito"/>
-          <w:b/>
-          <w:color w:val="003796"/>
-        </w:rPr>
-        <w:t>kerja</w:t>
-      </w:r>
-      <w:proofErr w:type="spellEnd"/>
     </w:p>
     <w:tbl>
       <w:tblPr>
@@ -3409,11 +3162,9 @@
             <w:pPr>
               <w:spacing w:before="20" w:after="20" w:line="252" w:lineRule="auto"/>
             </w:pPr>
-            <w:proofErr w:type="spellStart"/>
             <w:r>
               <w:t>Sesuai</w:t>
             </w:r>
-            <w:proofErr w:type="spellEnd"/>
           </w:p>
         </w:tc>
       </w:tr>
@@ -3483,11 +3234,9 @@
             <w:pPr>
               <w:spacing w:before="20" w:after="20" w:line="252" w:lineRule="auto"/>
             </w:pPr>
-            <w:proofErr w:type="spellStart"/>
             <w:r>
               <w:t>Sesuai</w:t>
             </w:r>
-            <w:proofErr w:type="spellEnd"/>
           </w:p>
         </w:tc>
       </w:tr>
@@ -3557,11 +3306,9 @@
             <w:pPr>
               <w:spacing w:before="20" w:after="20" w:line="252" w:lineRule="auto"/>
             </w:pPr>
-            <w:proofErr w:type="spellStart"/>
             <w:r>
               <w:t>Sesuai</w:t>
             </w:r>
-            <w:proofErr w:type="spellEnd"/>
           </w:p>
         </w:tc>
       </w:tr>
@@ -3850,39 +3597,7 @@
                 <w:rFonts w:cs="Carlito"/>
                 <w:sz w:val="19"/>
               </w:rPr>
-              <w:t xml:space="preserve">Node.js yang </w:t>
-            </w:r>
-            <w:proofErr w:type="spellStart"/>
-            <w:r>
-              <w:rPr>
-                <w:rFonts w:cs="Carlito"/>
-                <w:sz w:val="19"/>
-              </w:rPr>
-              <w:t>terpasang</w:t>
-            </w:r>
-            <w:proofErr w:type="spellEnd"/>
-            <w:r>
-              <w:rPr>
-                <w:rFonts w:cs="Carlito"/>
-                <w:sz w:val="19"/>
-              </w:rPr>
-              <w:t xml:space="preserve"> </w:t>
-            </w:r>
-            <w:proofErr w:type="spellStart"/>
-            <w:r>
-              <w:rPr>
-                <w:rFonts w:cs="Carlito"/>
-                <w:sz w:val="19"/>
-              </w:rPr>
-              <w:t>versi</w:t>
-            </w:r>
-            <w:proofErr w:type="spellEnd"/>
-            <w:r>
-              <w:rPr>
-                <w:rFonts w:cs="Carlito"/>
-                <w:sz w:val="19"/>
-              </w:rPr>
-              <w:t xml:space="preserve"> LTS, bukan Current</w:t>
+              <w:t>Node.js yang terpasang versi LTS, bukan Current</w:t>
             </w:r>
           </w:p>
         </w:tc>
@@ -3900,11 +3615,9 @@
             <w:pPr>
               <w:spacing w:before="20" w:after="20" w:line="252" w:lineRule="auto"/>
             </w:pPr>
-            <w:proofErr w:type="spellStart"/>
             <w:r>
               <w:t>Sudah</w:t>
             </w:r>
-            <w:proofErr w:type="spellEnd"/>
           </w:p>
         </w:tc>
       </w:tr>
@@ -3951,11 +3664,9 @@
             <w:pPr>
               <w:spacing w:before="20" w:after="20" w:line="252" w:lineRule="auto"/>
             </w:pPr>
-            <w:proofErr w:type="spellStart"/>
             <w:r>
               <w:t>Sudah</w:t>
             </w:r>
-            <w:proofErr w:type="spellEnd"/>
           </w:p>
         </w:tc>
       </w:tr>
@@ -4002,11 +3713,9 @@
             <w:pPr>
               <w:spacing w:before="20" w:after="20" w:line="252" w:lineRule="auto"/>
             </w:pPr>
-            <w:proofErr w:type="spellStart"/>
             <w:r>
               <w:t>Sudah</w:t>
             </w:r>
-            <w:proofErr w:type="spellEnd"/>
           </w:p>
         </w:tc>
       </w:tr>
@@ -4053,11 +3762,9 @@
             <w:pPr>
               <w:spacing w:before="20" w:after="20" w:line="252" w:lineRule="auto"/>
             </w:pPr>
-            <w:proofErr w:type="spellStart"/>
             <w:r>
               <w:t>Sudah</w:t>
             </w:r>
-            <w:proofErr w:type="spellEnd"/>
           </w:p>
         </w:tc>
       </w:tr>
@@ -4486,81 +4193,43 @@
                 <w:color w:val="E2E8F0"/>
                 <w:sz w:val="17"/>
               </w:rPr>
-              <w:t>cd ~/</w:t>
-            </w:r>
-            <w:proofErr w:type="spellStart"/>
+              <w:t>cd ~/pabw</w:t>
+            </w:r>
+            <w:r>
+              <w:br/>
+            </w:r>
             <w:r>
               <w:rPr>
                 <w:rFonts w:ascii="DejaVu Sans Mono" w:eastAsia="DejaVu Sans Mono" w:hAnsi="DejaVu Sans Mono" w:cs="DejaVu Sans Mono"/>
                 <w:color w:val="E2E8F0"/>
                 <w:sz w:val="17"/>
               </w:rPr>
-              <w:t>pabw</w:t>
-            </w:r>
-            <w:proofErr w:type="spellEnd"/>
+              <w:t>mkdir worksheet-p12</w:t>
+            </w:r>
             <w:r>
               <w:br/>
             </w:r>
-            <w:proofErr w:type="spellStart"/>
             <w:r>
               <w:rPr>
                 <w:rFonts w:ascii="DejaVu Sans Mono" w:eastAsia="DejaVu Sans Mono" w:hAnsi="DejaVu Sans Mono" w:cs="DejaVu Sans Mono"/>
                 <w:color w:val="E2E8F0"/>
                 <w:sz w:val="17"/>
               </w:rPr>
-              <w:t>mkdir</w:t>
-            </w:r>
-            <w:proofErr w:type="spellEnd"/>
+              <w:t>cd worksheet-p12</w:t>
+            </w:r>
+            <w:r>
+              <w:br/>
+            </w:r>
+            <w:r>
+              <w:br/>
+            </w:r>
             <w:r>
               <w:rPr>
                 <w:rFonts w:ascii="DejaVu Sans Mono" w:eastAsia="DejaVu Sans Mono" w:hAnsi="DejaVu Sans Mono" w:cs="DejaVu Sans Mono"/>
                 <w:color w:val="E2E8F0"/>
                 <w:sz w:val="17"/>
               </w:rPr>
-              <w:t xml:space="preserve"> worksheet-p12</w:t>
-            </w:r>
-            <w:r>
-              <w:br/>
-            </w:r>
-            <w:r>
-              <w:rPr>
-                <w:rFonts w:ascii="DejaVu Sans Mono" w:eastAsia="DejaVu Sans Mono" w:hAnsi="DejaVu Sans Mono" w:cs="DejaVu Sans Mono"/>
-                <w:color w:val="E2E8F0"/>
-                <w:sz w:val="17"/>
-              </w:rPr>
-              <w:t>cd worksheet-p12</w:t>
-            </w:r>
-            <w:r>
-              <w:br/>
-            </w:r>
-            <w:r>
-              <w:br/>
-            </w:r>
-            <w:r>
-              <w:rPr>
-                <w:rFonts w:ascii="DejaVu Sans Mono" w:eastAsia="DejaVu Sans Mono" w:hAnsi="DejaVu Sans Mono" w:cs="DejaVu Sans Mono"/>
-                <w:color w:val="E2E8F0"/>
-                <w:sz w:val="17"/>
-              </w:rPr>
-              <w:t>npm create vite@</w:t>
-            </w:r>
-            <w:proofErr w:type="gramStart"/>
-            <w:r>
-              <w:rPr>
-                <w:rFonts w:ascii="DejaVu Sans Mono" w:eastAsia="DejaVu Sans Mono" w:hAnsi="DejaVu Sans Mono" w:cs="DejaVu Sans Mono"/>
-                <w:color w:val="E2E8F0"/>
-                <w:sz w:val="17"/>
-              </w:rPr>
-              <w:t>latest .</w:t>
-            </w:r>
-            <w:proofErr w:type="gramEnd"/>
-            <w:r>
-              <w:rPr>
-                <w:rFonts w:ascii="DejaVu Sans Mono" w:eastAsia="DejaVu Sans Mono" w:hAnsi="DejaVu Sans Mono" w:cs="DejaVu Sans Mono"/>
-                <w:color w:val="E2E8F0"/>
-                <w:sz w:val="17"/>
-              </w:rPr>
-              <w:t xml:space="preserve"> -- --template vue</w:t>
+              <w:t>npm create vite@latest . -- --template vue</w:t>
             </w:r>
             <w:r>
               <w:br/>
@@ -4783,21 +4452,12 @@
             <w:pPr>
               <w:spacing w:before="20" w:after="20" w:line="252" w:lineRule="auto"/>
             </w:pPr>
-            <w:proofErr w:type="spellStart"/>
             <w:r>
               <w:rPr>
                 <w:rFonts w:cs="Carlito"/>
                 <w:sz w:val="18"/>
               </w:rPr>
-              <w:t>Pilih</w:t>
-            </w:r>
-            <w:proofErr w:type="spellEnd"/>
-            <w:r>
-              <w:rPr>
-                <w:rFonts w:cs="Carlito"/>
-                <w:sz w:val="18"/>
-              </w:rPr>
-              <w:t xml:space="preserve"> ini</w:t>
+              <w:t>Pilih ini</w:t>
             </w:r>
           </w:p>
         </w:tc>
@@ -5056,53 +4716,12 @@
         </w:rPr>
         <w:t xml:space="preserve">Periksa isinya sebelum menulis satu baris pun kode Anda sendiri. </w:t>
       </w:r>
-      <w:proofErr w:type="spellStart"/>
       <w:r>
         <w:rPr>
           <w:rFonts w:cs="Carlito"/>
           <w:sz w:val="20"/>
         </w:rPr>
-        <w:t>Sesudah</w:t>
-      </w:r>
-      <w:proofErr w:type="spellEnd"/>
-      <w:r>
-        <w:rPr>
-          <w:rFonts w:cs="Carlito"/>
-          <w:sz w:val="20"/>
-        </w:rPr>
-        <w:t xml:space="preserve"> ini, </w:t>
-      </w:r>
-      <w:proofErr w:type="spellStart"/>
-      <w:r>
-        <w:rPr>
-          <w:rFonts w:cs="Carlito"/>
-          <w:sz w:val="20"/>
-        </w:rPr>
-        <w:t>proyek</w:t>
-      </w:r>
-      <w:proofErr w:type="spellEnd"/>
-      <w:r>
-        <w:rPr>
-          <w:rFonts w:cs="Carlito"/>
-          <w:sz w:val="20"/>
-        </w:rPr>
-        <w:t xml:space="preserve"> </w:t>
-      </w:r>
-      <w:proofErr w:type="spellStart"/>
-      <w:r>
-        <w:rPr>
-          <w:rFonts w:cs="Carlito"/>
-          <w:sz w:val="20"/>
-        </w:rPr>
-        <w:t>milik</w:t>
-      </w:r>
-      <w:proofErr w:type="spellEnd"/>
-      <w:r>
-        <w:rPr>
-          <w:rFonts w:cs="Carlito"/>
-          <w:sz w:val="20"/>
-        </w:rPr>
-        <w:t xml:space="preserve"> Anda.</w:t>
+        <w:t>Sesudah ini, proyek milik Anda.</w:t>
       </w:r>
     </w:p>
     <w:tbl>
@@ -5306,21 +4925,12 @@
             <w:pPr>
               <w:spacing w:before="20" w:after="20" w:line="252" w:lineRule="auto"/>
             </w:pPr>
-            <w:proofErr w:type="spellStart"/>
             <w:r>
               <w:rPr>
                 <w:rFonts w:cs="Carlito"/>
                 <w:sz w:val="18"/>
               </w:rPr>
-              <w:t>src</w:t>
-            </w:r>
-            <w:proofErr w:type="spellEnd"/>
-            <w:r>
-              <w:rPr>
-                <w:rFonts w:cs="Carlito"/>
-                <w:sz w:val="18"/>
-              </w:rPr>
-              <w:t>/main.js</w:t>
+              <w:t>src/main.js</w:t>
             </w:r>
           </w:p>
         </w:tc>
@@ -5707,8 +5317,6 @@
             <w:pPr>
               <w:spacing w:before="20" w:after="20" w:line="252" w:lineRule="auto"/>
             </w:pPr>
-            <w:proofErr w:type="spellStart"/>
-            <w:proofErr w:type="gramStart"/>
             <w:r>
               <w:rPr>
                 <w:rFonts w:cs="Carlito"/>
@@ -5716,8 +5324,6 @@
               </w:rPr>
               <w:t>package.json</w:t>
             </w:r>
-            <w:proofErr w:type="spellEnd"/>
-            <w:proofErr w:type="gramEnd"/>
           </w:p>
         </w:tc>
         <w:tc>
@@ -6069,21 +5675,12 @@
             <w:pPr>
               <w:spacing w:before="20" w:after="20" w:line="252" w:lineRule="auto"/>
             </w:pPr>
-            <w:proofErr w:type="spellStart"/>
             <w:r>
               <w:rPr>
                 <w:rFonts w:cs="Carlito"/>
                 <w:sz w:val="19"/>
               </w:rPr>
-              <w:t>dist</w:t>
-            </w:r>
-            <w:proofErr w:type="spellEnd"/>
-            <w:r>
-              <w:rPr>
-                <w:rFonts w:cs="Carlito"/>
-                <w:sz w:val="19"/>
-              </w:rPr>
-              <w:t>/</w:t>
+              <w:t>dist/</w:t>
             </w:r>
           </w:p>
         </w:tc>
@@ -6347,6 +5944,9 @@
             <w:pPr>
               <w:spacing w:before="20" w:after="20" w:line="252" w:lineRule="auto"/>
             </w:pPr>
+            <w:r>
+              <w:t>Sesuai</w:t>
+            </w:r>
           </w:p>
         </w:tc>
       </w:tr>
@@ -6416,6 +6016,9 @@
             <w:pPr>
               <w:spacing w:before="20" w:after="20" w:line="252" w:lineRule="auto"/>
             </w:pPr>
+            <w:r>
+              <w:t>Sesuai</w:t>
+            </w:r>
           </w:p>
         </w:tc>
       </w:tr>
@@ -6485,6 +6088,9 @@
             <w:pPr>
               <w:spacing w:before="20" w:after="20" w:line="252" w:lineRule="auto"/>
             </w:pPr>
+            <w:r>
+              <w:t>Sesuai</w:t>
+            </w:r>
           </w:p>
         </w:tc>
       </w:tr>
@@ -6554,6 +6160,9 @@
             <w:pPr>
               <w:spacing w:before="20" w:after="20" w:line="252" w:lineRule="auto"/>
             </w:pPr>
+            <w:r>
+              <w:t>Sesuai</w:t>
+            </w:r>
           </w:p>
         </w:tc>
       </w:tr>
@@ -6623,6 +6232,9 @@
             <w:pPr>
               <w:spacing w:before="20" w:after="20" w:line="252" w:lineRule="auto"/>
             </w:pPr>
+            <w:r>
+              <w:t>Sesuai</w:t>
+            </w:r>
           </w:p>
         </w:tc>
       </w:tr>
@@ -6708,23 +6320,13 @@
             <w:pPr>
               <w:spacing w:before="40" w:after="40"/>
             </w:pPr>
-            <w:proofErr w:type="gramStart"/>
             <w:r>
               <w:rPr>
                 <w:rFonts w:cs="Carlito"/>
                 <w:b/>
                 <w:color w:val="FFFFFF"/>
               </w:rPr>
-              <w:t>▌  SIMPAN</w:t>
-            </w:r>
-            <w:proofErr w:type="gramEnd"/>
-            <w:r>
-              <w:rPr>
-                <w:rFonts w:cs="Carlito"/>
-                <w:b/>
-                <w:color w:val="FFFFFF"/>
-              </w:rPr>
-              <w:t xml:space="preserve"> KE GIT — SETELAH LEMBAR B</w:t>
+              <w:t>▌  SIMPAN KE GIT — SETELAH LEMBAR B</w:t>
             </w:r>
           </w:p>
         </w:tc>
@@ -7098,7 +6700,6 @@
             <w:pPr>
               <w:spacing w:before="20" w:after="20"/>
             </w:pPr>
-            <w:proofErr w:type="spellStart"/>
             <w:r>
               <w:rPr>
                 <w:rFonts w:cs="Carlito"/>
@@ -7106,17 +6707,7 @@
                 <w:color w:val="FFFFFF"/>
                 <w:sz w:val="18"/>
               </w:rPr>
-              <w:t>Berkas</w:t>
-            </w:r>
-            <w:proofErr w:type="spellEnd"/>
-            <w:r>
-              <w:rPr>
-                <w:rFonts w:cs="Carlito"/>
-                <w:b/>
-                <w:color w:val="FFFFFF"/>
-                <w:sz w:val="18"/>
-              </w:rPr>
-              <w:t xml:space="preserve"> P11</w:t>
+              <w:t>Berkas P11</w:t>
             </w:r>
           </w:p>
         </w:tc>
@@ -7349,37 +6940,12 @@
             <w:pPr>
               <w:spacing w:before="20" w:after="20" w:line="252" w:lineRule="auto"/>
             </w:pPr>
-            <w:proofErr w:type="spellStart"/>
             <w:r>
               <w:rPr>
                 <w:rFonts w:cs="Carlito"/>
                 <w:sz w:val="18"/>
               </w:rPr>
-              <w:t>js</w:t>
-            </w:r>
-            <w:proofErr w:type="spellEnd"/>
-            <w:r>
-              <w:rPr>
-                <w:rFonts w:cs="Carlito"/>
-                <w:sz w:val="18"/>
-              </w:rPr>
-              <w:t xml:space="preserve">/app.js, </w:t>
-            </w:r>
-            <w:proofErr w:type="spellStart"/>
-            <w:r>
-              <w:rPr>
-                <w:rFonts w:cs="Carlito"/>
-                <w:sz w:val="18"/>
-              </w:rPr>
-              <w:t>js</w:t>
-            </w:r>
-            <w:proofErr w:type="spellEnd"/>
-            <w:r>
-              <w:rPr>
-                <w:rFonts w:cs="Carlito"/>
-                <w:sz w:val="18"/>
-              </w:rPr>
-              <w:t>/dom.js</w:t>
+              <w:t>js/app.js, js/dom.js</w:t>
             </w:r>
           </w:p>
         </w:tc>
@@ -7424,21 +6990,12 @@
             <w:pPr>
               <w:spacing w:before="20" w:after="20" w:line="252" w:lineRule="auto"/>
             </w:pPr>
-            <w:proofErr w:type="spellStart"/>
             <w:r>
               <w:rPr>
                 <w:rFonts w:cs="Carlito"/>
                 <w:sz w:val="18"/>
               </w:rPr>
-              <w:t>Dipecah</w:t>
-            </w:r>
-            <w:proofErr w:type="spellEnd"/>
-            <w:r>
-              <w:rPr>
-                <w:rFonts w:cs="Carlito"/>
-                <w:sz w:val="18"/>
-              </w:rPr>
-              <w:t xml:space="preserve"> di lembar D</w:t>
+              <w:t>Dipecah di lembar D</w:t>
             </w:r>
           </w:p>
         </w:tc>
@@ -7513,31 +7070,13 @@
             <w:pPr>
               <w:spacing w:before="20" w:after="20" w:line="252" w:lineRule="auto"/>
             </w:pPr>
-            <w:proofErr w:type="spellStart"/>
             <w:r>
               <w:rPr>
                 <w:rFonts w:cs="Carlito"/>
                 <w:sz w:val="18"/>
               </w:rPr>
-              <w:t>Isinya</w:t>
-            </w:r>
-            <w:proofErr w:type="spellEnd"/>
-            <w:r>
-              <w:rPr>
-                <w:rFonts w:cs="Carlito"/>
-                <w:sz w:val="18"/>
-              </w:rPr>
-              <w:t xml:space="preserve"> </w:t>
-            </w:r>
-            <w:proofErr w:type="spellStart"/>
-            <w:r>
-              <w:rPr>
-                <w:rFonts w:cs="Carlito"/>
-                <w:sz w:val="18"/>
-              </w:rPr>
-              <w:t>tetap</w:t>
-            </w:r>
-            <w:proofErr w:type="spellEnd"/>
+              <w:t>Isinya tetap</w:t>
+            </w:r>
           </w:p>
         </w:tc>
       </w:tr>
@@ -7744,21 +7283,12 @@
             <w:pPr>
               <w:spacing w:before="20" w:after="20" w:line="252" w:lineRule="auto"/>
             </w:pPr>
-            <w:proofErr w:type="spellStart"/>
             <w:r>
               <w:rPr>
                 <w:rFonts w:cs="Carlito"/>
                 <w:sz w:val="18"/>
               </w:rPr>
-              <w:t>src</w:t>
-            </w:r>
-            <w:proofErr w:type="spellEnd"/>
-            <w:r>
-              <w:rPr>
-                <w:rFonts w:cs="Carlito"/>
-                <w:sz w:val="18"/>
-              </w:rPr>
-              <w:t>/api.js</w:t>
+              <w:t>src/api.js</w:t>
             </w:r>
           </w:p>
         </w:tc>
@@ -8128,6 +7658,9 @@
             <w:pPr>
               <w:spacing w:before="20" w:after="20" w:line="252" w:lineRule="auto"/>
             </w:pPr>
+            <w:r>
+              <w:t>Sesuai</w:t>
+            </w:r>
           </w:p>
         </w:tc>
       </w:tr>
@@ -8197,6 +7730,9 @@
             <w:pPr>
               <w:spacing w:before="20" w:after="20" w:line="252" w:lineRule="auto"/>
             </w:pPr>
+            <w:r>
+              <w:t>Sesuai</w:t>
+            </w:r>
           </w:p>
         </w:tc>
       </w:tr>
@@ -8266,6 +7802,9 @@
             <w:pPr>
               <w:spacing w:before="20" w:after="20" w:line="252" w:lineRule="auto"/>
             </w:pPr>
+            <w:r>
+              <w:t>Sesuai</w:t>
+            </w:r>
           </w:p>
         </w:tc>
       </w:tr>
@@ -8335,6 +7874,9 @@
             <w:pPr>
               <w:spacing w:before="20" w:after="20" w:line="252" w:lineRule="auto"/>
             </w:pPr>
+            <w:r>
+              <w:t>Sesuai</w:t>
+            </w:r>
           </w:p>
         </w:tc>
       </w:tr>
@@ -8404,6 +7946,9 @@
             <w:pPr>
               <w:spacing w:before="20" w:after="20" w:line="252" w:lineRule="auto"/>
             </w:pPr>
+            <w:r>
+              <w:t>Sesuai</w:t>
+            </w:r>
           </w:p>
         </w:tc>
       </w:tr>
@@ -8484,53 +8029,12 @@
         </w:rPr>
         <w:t xml:space="preserve">js/api.js dan file pendukungnya (misalnya proyek.json) ikut dipindahkan, bukan dibuang. </w:t>
       </w:r>
-      <w:proofErr w:type="spellStart"/>
       <w:r>
         <w:rPr>
           <w:rFonts w:cs="Carlito"/>
           <w:sz w:val="20"/>
         </w:rPr>
-        <w:t>Letaknya</w:t>
-      </w:r>
-      <w:proofErr w:type="spellEnd"/>
-      <w:r>
-        <w:rPr>
-          <w:rFonts w:cs="Carlito"/>
-          <w:sz w:val="20"/>
-        </w:rPr>
-        <w:t xml:space="preserve"> </w:t>
-      </w:r>
-      <w:proofErr w:type="spellStart"/>
-      <w:r>
-        <w:rPr>
-          <w:rFonts w:cs="Carlito"/>
-          <w:sz w:val="20"/>
-        </w:rPr>
-        <w:t>ditentukan</w:t>
-      </w:r>
-      <w:proofErr w:type="spellEnd"/>
-      <w:r>
-        <w:rPr>
-          <w:rFonts w:cs="Carlito"/>
-          <w:sz w:val="20"/>
-        </w:rPr>
-        <w:t xml:space="preserve"> </w:t>
-      </w:r>
-      <w:proofErr w:type="spellStart"/>
-      <w:r>
-        <w:rPr>
-          <w:rFonts w:cs="Carlito"/>
-          <w:sz w:val="20"/>
-        </w:rPr>
-        <w:t>bentuknya</w:t>
-      </w:r>
-      <w:proofErr w:type="spellEnd"/>
-      <w:r>
-        <w:rPr>
-          <w:rFonts w:cs="Carlito"/>
-          <w:sz w:val="20"/>
-        </w:rPr>
-        <w:t>, bukan selera.</w:t>
+        <w:t>Letaknya ditentukan bentuknya, bukan selera.</w:t>
       </w:r>
     </w:p>
     <w:tbl>
@@ -8998,6 +8502,9 @@
             <w:pPr>
               <w:spacing w:before="20" w:after="20" w:line="252" w:lineRule="auto"/>
             </w:pPr>
+            <w:r>
+              <w:t>Sesuai</w:t>
+            </w:r>
           </w:p>
         </w:tc>
       </w:tr>
@@ -9067,6 +8574,9 @@
             <w:pPr>
               <w:spacing w:before="20" w:after="20" w:line="252" w:lineRule="auto"/>
             </w:pPr>
+            <w:r>
+              <w:t>Sesuai</w:t>
+            </w:r>
           </w:p>
         </w:tc>
       </w:tr>
@@ -9136,6 +8646,9 @@
             <w:pPr>
               <w:spacing w:before="20" w:after="20" w:line="252" w:lineRule="auto"/>
             </w:pPr>
+            <w:r>
+              <w:t>Sesuai</w:t>
+            </w:r>
           </w:p>
         </w:tc>
       </w:tr>
@@ -9205,6 +8718,9 @@
             <w:pPr>
               <w:spacing w:before="20" w:after="20" w:line="252" w:lineRule="auto"/>
             </w:pPr>
+            <w:r>
+              <w:t>Sesuai</w:t>
+            </w:r>
           </w:p>
         </w:tc>
       </w:tr>
@@ -9563,55 +9079,7 @@
           <w:rFonts w:cs="Carlito"/>
           <w:sz w:val="20"/>
         </w:rPr>
-        <w:t xml:space="preserve">Bagian </w:t>
-      </w:r>
-      <w:proofErr w:type="spellStart"/>
-      <w:r>
-        <w:rPr>
-          <w:rFonts w:cs="Carlito"/>
-          <w:sz w:val="20"/>
-        </w:rPr>
-        <w:t>halaman</w:t>
-      </w:r>
-      <w:proofErr w:type="spellEnd"/>
-      <w:r>
-        <w:rPr>
-          <w:rFonts w:cs="Carlito"/>
-          <w:sz w:val="20"/>
-        </w:rPr>
-        <w:t xml:space="preserve"> yang </w:t>
-      </w:r>
-      <w:proofErr w:type="spellStart"/>
-      <w:r>
-        <w:rPr>
-          <w:rFonts w:cs="Carlito"/>
-          <w:sz w:val="20"/>
-        </w:rPr>
-        <w:t>sudah</w:t>
-      </w:r>
-      <w:proofErr w:type="spellEnd"/>
-      <w:r>
-        <w:rPr>
-          <w:rFonts w:cs="Carlito"/>
-          <w:sz w:val="20"/>
-        </w:rPr>
-        <w:t xml:space="preserve"> </w:t>
-      </w:r>
-      <w:proofErr w:type="spellStart"/>
-      <w:r>
-        <w:rPr>
-          <w:rFonts w:cs="Carlito"/>
-          <w:sz w:val="20"/>
-        </w:rPr>
-        <w:t>ada</w:t>
-      </w:r>
-      <w:proofErr w:type="spellEnd"/>
-      <w:r>
-        <w:rPr>
-          <w:rFonts w:cs="Carlito"/>
-          <w:sz w:val="20"/>
-        </w:rPr>
-        <w:t xml:space="preserve"> di layar menjadi satu berkas. Aturannya sama dengan waktu memecah JavaScript di Pertemuan 11 — hanya bentuk berkasnya yang berbeda.</w:t>
+        <w:t>Bagian halaman yang sudah ada di layar menjadi satu berkas. Aturannya sama dengan waktu memecah JavaScript di Pertemuan 11 — hanya bentuk berkasnya yang berbeda.</w:t>
       </w:r>
     </w:p>
     <w:p>
@@ -9670,7 +9138,6 @@
             <w:pPr>
               <w:spacing w:before="20" w:after="20"/>
             </w:pPr>
-            <w:proofErr w:type="spellStart"/>
             <w:r>
               <w:rPr>
                 <w:rFonts w:cs="Carlito"/>
@@ -9680,7 +9147,6 @@
               </w:rPr>
               <w:t>Komponen</w:t>
             </w:r>
-            <w:proofErr w:type="spellEnd"/>
           </w:p>
         </w:tc>
         <w:tc>
@@ -9836,7 +9302,6 @@
             <w:pPr>
               <w:spacing w:before="20" w:after="20" w:line="252" w:lineRule="auto"/>
             </w:pPr>
-            <w:proofErr w:type="spellStart"/>
             <w:r>
               <w:rPr>
                 <w:rFonts w:cs="Carlito"/>
@@ -9844,7 +9309,6 @@
               </w:rPr>
               <w:t>TombolFilter.vue</w:t>
             </w:r>
-            <w:proofErr w:type="spellEnd"/>
           </w:p>
         </w:tc>
         <w:tc>
@@ -9893,17 +9357,8 @@
                 <w:rFonts w:cs="Carlito"/>
                 <w:sz w:val="18"/>
               </w:rPr>
-              <w:t xml:space="preserve">state </w:t>
-            </w:r>
-            <w:proofErr w:type="spellStart"/>
-            <w:r>
-              <w:rPr>
-                <w:rFonts w:cs="Carlito"/>
-                <w:sz w:val="18"/>
-              </w:rPr>
-              <w:t>bersama</w:t>
-            </w:r>
-            <w:proofErr w:type="spellEnd"/>
+              <w:t>state bersama</w:t>
+            </w:r>
           </w:p>
         </w:tc>
       </w:tr>
@@ -9982,17 +9437,8 @@
                 <w:rFonts w:cs="Carlito"/>
                 <w:sz w:val="18"/>
               </w:rPr>
-              <w:t xml:space="preserve">state </w:t>
-            </w:r>
-            <w:proofErr w:type="spellStart"/>
-            <w:r>
-              <w:rPr>
-                <w:rFonts w:cs="Carlito"/>
-                <w:sz w:val="18"/>
-              </w:rPr>
-              <w:t>bersama</w:t>
-            </w:r>
-            <w:proofErr w:type="spellEnd"/>
+              <w:t>state bersama</w:t>
+            </w:r>
           </w:p>
         </w:tc>
       </w:tr>
@@ -10146,27 +9592,7 @@
                 <w:color w:val="FFFFFF"/>
                 <w:sz w:val="19"/>
               </w:rPr>
-              <w:t xml:space="preserve">Yang Anda </w:t>
-            </w:r>
-            <w:proofErr w:type="spellStart"/>
-            <w:r>
-              <w:rPr>
-                <w:rFonts w:cs="Carlito"/>
-                <w:b/>
-                <w:color w:val="FFFFFF"/>
-                <w:sz w:val="19"/>
-              </w:rPr>
-              <w:t>tulis</w:t>
-            </w:r>
-            <w:proofErr w:type="spellEnd"/>
-            <w:r>
-              <w:rPr>
-                <w:rFonts w:cs="Carlito"/>
-                <w:b/>
-                <w:color w:val="FFFFFF"/>
-                <w:sz w:val="19"/>
-              </w:rPr>
-              <w:t xml:space="preserve"> di P08–P11</w:t>
+              <w:t>Yang Anda tulis di P08–P11</w:t>
             </w:r>
           </w:p>
         </w:tc>
@@ -10978,17 +10404,8 @@
                 <w:rFonts w:cs="Carlito"/>
                 <w:sz w:val="18"/>
               </w:rPr>
-              <w:t xml:space="preserve">props </w:t>
-            </w:r>
-            <w:proofErr w:type="spellStart"/>
-            <w:r>
-              <w:rPr>
-                <w:rFonts w:cs="Carlito"/>
-                <w:sz w:val="18"/>
-              </w:rPr>
-              <w:t>KepalaProfil</w:t>
-            </w:r>
-            <w:proofErr w:type="spellEnd"/>
+              <w:t>props KepalaProfil</w:t>
+            </w:r>
           </w:p>
         </w:tc>
         <w:tc>
@@ -11064,55 +10481,7 @@
                 <w:sz w:val="18"/>
               </w:rPr>
               <w:lastRenderedPageBreak/>
-              <w:t xml:space="preserve">props </w:t>
-            </w:r>
-            <w:proofErr w:type="spellStart"/>
-            <w:r>
-              <w:rPr>
-                <w:rFonts w:cs="Carlito"/>
-                <w:sz w:val="18"/>
-              </w:rPr>
-              <w:t>diubah</w:t>
-            </w:r>
-            <w:proofErr w:type="spellEnd"/>
-            <w:r>
-              <w:rPr>
-                <w:rFonts w:cs="Carlito"/>
-                <w:sz w:val="18"/>
-              </w:rPr>
-              <w:t xml:space="preserve"> </w:t>
-            </w:r>
-            <w:proofErr w:type="spellStart"/>
-            <w:r>
-              <w:rPr>
-                <w:rFonts w:cs="Carlito"/>
-                <w:sz w:val="18"/>
-              </w:rPr>
-              <w:t>dari</w:t>
-            </w:r>
-            <w:proofErr w:type="spellEnd"/>
-            <w:r>
-              <w:rPr>
-                <w:rFonts w:cs="Carlito"/>
-                <w:sz w:val="18"/>
-              </w:rPr>
-              <w:t xml:space="preserve"> </w:t>
-            </w:r>
-            <w:proofErr w:type="spellStart"/>
-            <w:r>
-              <w:rPr>
-                <w:rFonts w:cs="Carlito"/>
-                <w:sz w:val="18"/>
-              </w:rPr>
-              <w:t>anak</w:t>
-            </w:r>
-            <w:proofErr w:type="spellEnd"/>
-            <w:r>
-              <w:rPr>
-                <w:rFonts w:cs="Carlito"/>
-                <w:sz w:val="18"/>
-              </w:rPr>
-              <w:t>?</w:t>
+              <w:t>props diubah dari anak?</w:t>
             </w:r>
           </w:p>
         </w:tc>
@@ -11355,69 +10724,13 @@
         <w:keepNext/>
         <w:spacing w:before="160" w:after="60"/>
       </w:pPr>
-      <w:proofErr w:type="gramStart"/>
       <w:r>
         <w:rPr>
           <w:rFonts w:cs="Carlito"/>
           <w:b/>
           <w:color w:val="003796"/>
         </w:rPr>
-        <w:t xml:space="preserve">D.4  </w:t>
-      </w:r>
-      <w:proofErr w:type="spellStart"/>
-      <w:r>
-        <w:rPr>
-          <w:rFonts w:cs="Carlito"/>
-          <w:b/>
-          <w:color w:val="003796"/>
-        </w:rPr>
-        <w:t>Pohon</w:t>
-      </w:r>
-      <w:proofErr w:type="spellEnd"/>
-      <w:proofErr w:type="gramEnd"/>
-      <w:r>
-        <w:rPr>
-          <w:rFonts w:cs="Carlito"/>
-          <w:b/>
-          <w:color w:val="003796"/>
-        </w:rPr>
-        <w:t xml:space="preserve"> </w:t>
-      </w:r>
-      <w:proofErr w:type="spellStart"/>
-      <w:r>
-        <w:rPr>
-          <w:rFonts w:cs="Carlito"/>
-          <w:b/>
-          <w:color w:val="003796"/>
-        </w:rPr>
-        <w:t>komponen</w:t>
-      </w:r>
-      <w:proofErr w:type="spellEnd"/>
-      <w:r>
-        <w:rPr>
-          <w:rFonts w:cs="Carlito"/>
-          <w:b/>
-          <w:color w:val="003796"/>
-        </w:rPr>
-        <w:t xml:space="preserve"> yang </w:t>
-      </w:r>
-      <w:proofErr w:type="spellStart"/>
-      <w:r>
-        <w:rPr>
-          <w:rFonts w:cs="Carlito"/>
-          <w:b/>
-          <w:color w:val="003796"/>
-        </w:rPr>
-        <w:t>saya</w:t>
-      </w:r>
-      <w:proofErr w:type="spellEnd"/>
-      <w:r>
-        <w:rPr>
-          <w:rFonts w:cs="Carlito"/>
-          <w:b/>
-          <w:color w:val="003796"/>
-        </w:rPr>
-        <w:t xml:space="preserve"> susun</w:t>
+        <w:t>D.4  Pohon komponen yang saya susun</w:t>
       </w:r>
     </w:p>
     <w:tbl>
@@ -11509,7 +10822,6 @@
             <w:pPr>
               <w:spacing w:before="20" w:after="20"/>
             </w:pPr>
-            <w:proofErr w:type="spellStart"/>
             <w:r>
               <w:rPr>
                 <w:rFonts w:cs="Carlito"/>
@@ -11517,17 +10829,7 @@
                 <w:color w:val="FFFFFF"/>
                 <w:sz w:val="18"/>
               </w:rPr>
-              <w:t>Menerima</w:t>
-            </w:r>
-            <w:proofErr w:type="spellEnd"/>
-            <w:r>
-              <w:rPr>
-                <w:rFonts w:cs="Carlito"/>
-                <w:b/>
-                <w:color w:val="FFFFFF"/>
-                <w:sz w:val="18"/>
-              </w:rPr>
-              <w:t xml:space="preserve"> props?</w:t>
+              <w:t>Menerima props?</w:t>
             </w:r>
           </w:p>
         </w:tc>
@@ -12203,7 +11505,6 @@
             <w:pPr>
               <w:spacing w:before="20" w:after="20"/>
             </w:pPr>
-            <w:proofErr w:type="spellStart"/>
             <w:r>
               <w:rPr>
                 <w:rFonts w:cs="Carlito"/>
@@ -12211,17 +11512,7 @@
                 <w:color w:val="FFFFFF"/>
                 <w:sz w:val="18"/>
               </w:rPr>
-              <w:t>Pertemuan</w:t>
-            </w:r>
-            <w:proofErr w:type="spellEnd"/>
-            <w:r>
-              <w:rPr>
-                <w:rFonts w:cs="Carlito"/>
-                <w:b/>
-                <w:color w:val="FFFFFF"/>
-                <w:sz w:val="18"/>
-              </w:rPr>
-              <w:t xml:space="preserve"> 11</w:t>
+              <w:t>Pertemuan 11</w:t>
             </w:r>
           </w:p>
         </w:tc>
@@ -12459,23 +11750,7 @@
                 <w:rFonts w:cs="Carlito"/>
                 <w:sz w:val="18"/>
               </w:rPr>
-              <w:t xml:space="preserve">render(state) </w:t>
-            </w:r>
-            <w:proofErr w:type="spellStart"/>
-            <w:r>
-              <w:rPr>
-                <w:rFonts w:cs="Carlito"/>
-                <w:sz w:val="18"/>
-              </w:rPr>
-              <w:t>ditulis</w:t>
-            </w:r>
-            <w:proofErr w:type="spellEnd"/>
-            <w:r>
-              <w:rPr>
-                <w:rFonts w:cs="Carlito"/>
-                <w:sz w:val="18"/>
-              </w:rPr>
-              <w:t xml:space="preserve"> sendiri</w:t>
+              <w:t>render(state) ditulis sendiri</w:t>
             </w:r>
           </w:p>
         </w:tc>
@@ -12899,69 +12174,12 @@
       </w:r>
     </w:p>
     <w:p>
-      <w:proofErr w:type="spellStart"/>
       <w:r>
         <w:rPr>
           <w:rFonts w:cs="Carlito"/>
           <w:sz w:val="20"/>
         </w:rPr>
-        <w:t>onMounted</w:t>
-      </w:r>
-      <w:proofErr w:type="spellEnd"/>
-      <w:r>
-        <w:rPr>
-          <w:rFonts w:cs="Carlito"/>
-          <w:sz w:val="20"/>
-        </w:rPr>
-        <w:t xml:space="preserve"> </w:t>
-      </w:r>
-      <w:proofErr w:type="spellStart"/>
-      <w:r>
-        <w:rPr>
-          <w:rFonts w:cs="Carlito"/>
-          <w:sz w:val="20"/>
-        </w:rPr>
-        <w:t>membaca</w:t>
-      </w:r>
-      <w:proofErr w:type="spellEnd"/>
-      <w:r>
-        <w:rPr>
-          <w:rFonts w:cs="Carlito"/>
-          <w:sz w:val="20"/>
-        </w:rPr>
-        <w:t xml:space="preserve"> </w:t>
-      </w:r>
-      <w:proofErr w:type="spellStart"/>
-      <w:r>
-        <w:rPr>
-          <w:rFonts w:cs="Carlito"/>
-          <w:sz w:val="20"/>
-        </w:rPr>
-        <w:t>simpanan</w:t>
-      </w:r>
-      <w:proofErr w:type="spellEnd"/>
-      <w:r>
-        <w:rPr>
-          <w:rFonts w:cs="Carlito"/>
-          <w:sz w:val="20"/>
-        </w:rPr>
-        <w:t xml:space="preserve"> </w:t>
-      </w:r>
-      <w:proofErr w:type="spellStart"/>
-      <w:r>
-        <w:rPr>
-          <w:rFonts w:cs="Carlito"/>
-          <w:sz w:val="20"/>
-        </w:rPr>
-        <w:t>satu</w:t>
-      </w:r>
-      <w:proofErr w:type="spellEnd"/>
-      <w:r>
-        <w:rPr>
-          <w:rFonts w:cs="Carlito"/>
-          <w:sz w:val="20"/>
-        </w:rPr>
-        <w:t xml:space="preserve"> kali, saat komponen pertama dipasang. watch menulis simpanan setiap kali state berubah. Tidak ada pemanggilan penyimpanan di dalam template. Fungsi muat(), simpan(), pulihkan(), dan isiProyek() adalah fungsi dari state.js Pertemuan 11 yang ikut dipindah. Keempat keadaan dari Pertemuan 10 (memuat, berhasil, kosong, gagal) tetap ditampilkan, sekarang dengan v-if di DaftarProyek.vue.</w:t>
+        <w:t>onMounted membaca simpanan satu kali, saat komponen pertama dipasang. watch menulis simpanan setiap kali state berubah. Tidak ada pemanggilan penyimpanan di dalam template. Fungsi muat(), simpan(), pulihkan(), dan isiProyek() adalah fungsi dari state.js Pertemuan 11 yang ikut dipindah. Keempat keadaan dari Pertemuan 10 (memuat, berhasil, kosong, gagal) tetap ditampilkan, sekarang dengan v-if di DaftarProyek.vue.</w:t>
       </w:r>
     </w:p>
     <w:tbl>
@@ -13444,63 +12662,13 @@
             <w:pPr>
               <w:spacing w:before="20" w:after="20" w:line="252" w:lineRule="auto"/>
             </w:pPr>
-            <w:proofErr w:type="spellStart"/>
             <w:r>
               <w:rPr>
                 <w:rFonts w:cs="Carlito"/>
                 <w:sz w:val="18"/>
               </w:rPr>
-              <w:t>Pilihan</w:t>
-            </w:r>
-            <w:proofErr w:type="spellEnd"/>
-            <w:r>
-              <w:rPr>
-                <w:rFonts w:cs="Carlito"/>
-                <w:sz w:val="18"/>
-              </w:rPr>
-              <w:t xml:space="preserve"> </w:t>
-            </w:r>
-            <w:proofErr w:type="spellStart"/>
-            <w:r>
-              <w:rPr>
-                <w:rFonts w:cs="Carlito"/>
-                <w:sz w:val="18"/>
-              </w:rPr>
-              <w:t>terakhir</w:t>
-            </w:r>
-            <w:proofErr w:type="spellEnd"/>
-            <w:r>
-              <w:rPr>
-                <w:rFonts w:cs="Carlito"/>
-                <w:sz w:val="18"/>
-              </w:rPr>
-              <w:t xml:space="preserve"> </w:t>
-            </w:r>
-            <w:proofErr w:type="spellStart"/>
-            <w:r>
-              <w:rPr>
-                <w:rFonts w:cs="Carlito"/>
-                <w:sz w:val="18"/>
-              </w:rPr>
-              <w:t>masih</w:t>
-            </w:r>
-            <w:proofErr w:type="spellEnd"/>
-            <w:r>
-              <w:rPr>
-                <w:rFonts w:cs="Carlito"/>
-                <w:sz w:val="18"/>
-              </w:rPr>
-              <w:t xml:space="preserve"> </w:t>
-            </w:r>
-            <w:proofErr w:type="spellStart"/>
-            <w:r>
-              <w:rPr>
-                <w:rFonts w:cs="Carlito"/>
-                <w:sz w:val="18"/>
-              </w:rPr>
-              <w:t>ada</w:t>
-            </w:r>
-            <w:proofErr w:type="spellEnd"/>
+              <w:t>Pilihan terakhir masih ada</w:t>
+            </w:r>
           </w:p>
         </w:tc>
         <w:tc>
@@ -13802,27 +12970,7 @@
                 <w:color w:val="FFFFFF"/>
                 <w:sz w:val="18"/>
               </w:rPr>
-              <w:t xml:space="preserve">Yang </w:t>
-            </w:r>
-            <w:proofErr w:type="spellStart"/>
-            <w:r>
-              <w:rPr>
-                <w:rFonts w:cs="Carlito"/>
-                <w:b/>
-                <w:color w:val="FFFFFF"/>
-                <w:sz w:val="18"/>
-              </w:rPr>
-              <w:t>ditulis</w:t>
-            </w:r>
-            <w:proofErr w:type="spellEnd"/>
-            <w:r>
-              <w:rPr>
-                <w:rFonts w:cs="Carlito"/>
-                <w:b/>
-                <w:color w:val="FFFFFF"/>
-                <w:sz w:val="18"/>
-              </w:rPr>
-              <w:t xml:space="preserve"> di Console</w:t>
+              <w:t>Yang ditulis di Console</w:t>
             </w:r>
           </w:p>
         </w:tc>
@@ -14002,63 +13150,13 @@
             <w:pPr>
               <w:spacing w:before="20" w:after="20" w:line="252" w:lineRule="auto"/>
             </w:pPr>
-            <w:proofErr w:type="spellStart"/>
             <w:r>
               <w:rPr>
                 <w:rFonts w:cs="Carlito"/>
                 <w:sz w:val="18"/>
               </w:rPr>
-              <w:t>Pilihan</w:t>
-            </w:r>
-            <w:proofErr w:type="spellEnd"/>
-            <w:r>
-              <w:rPr>
-                <w:rFonts w:cs="Carlito"/>
-                <w:sz w:val="18"/>
-              </w:rPr>
-              <w:t xml:space="preserve"> </w:t>
-            </w:r>
-            <w:proofErr w:type="spellStart"/>
-            <w:r>
-              <w:rPr>
-                <w:rFonts w:cs="Carlito"/>
-                <w:sz w:val="18"/>
-              </w:rPr>
-              <w:t>terakhir</w:t>
-            </w:r>
-            <w:proofErr w:type="spellEnd"/>
-            <w:r>
-              <w:rPr>
-                <w:rFonts w:cs="Carlito"/>
-                <w:sz w:val="18"/>
-              </w:rPr>
-              <w:t xml:space="preserve"> </w:t>
-            </w:r>
-            <w:proofErr w:type="spellStart"/>
-            <w:r>
-              <w:rPr>
-                <w:rFonts w:cs="Carlito"/>
-                <w:sz w:val="18"/>
-              </w:rPr>
-              <w:t>tetap</w:t>
-            </w:r>
-            <w:proofErr w:type="spellEnd"/>
-            <w:r>
-              <w:rPr>
-                <w:rFonts w:cs="Carlito"/>
-                <w:sz w:val="18"/>
-              </w:rPr>
-              <w:t xml:space="preserve"> </w:t>
-            </w:r>
-            <w:proofErr w:type="spellStart"/>
-            <w:r>
-              <w:rPr>
-                <w:rFonts w:cs="Carlito"/>
-                <w:sz w:val="18"/>
-              </w:rPr>
-              <w:t>ada</w:t>
-            </w:r>
-            <w:proofErr w:type="spellEnd"/>
+              <w:t>Pilihan terakhir tetap ada</w:t>
+            </w:r>
           </w:p>
         </w:tc>
         <w:tc>
@@ -14239,23 +13337,13 @@
             <w:pPr>
               <w:spacing w:before="40" w:after="40"/>
             </w:pPr>
-            <w:proofErr w:type="gramStart"/>
             <w:r>
               <w:rPr>
                 <w:rFonts w:cs="Carlito"/>
                 <w:b/>
                 <w:color w:val="FFFFFF"/>
               </w:rPr>
-              <w:t>▌  SIMPAN</w:t>
-            </w:r>
-            <w:proofErr w:type="gramEnd"/>
-            <w:r>
-              <w:rPr>
-                <w:rFonts w:cs="Carlito"/>
-                <w:b/>
-                <w:color w:val="FFFFFF"/>
-              </w:rPr>
-              <w:t xml:space="preserve"> KE GIT — SETELAH LEMBAR E</w:t>
+              <w:t>▌  SIMPAN KE GIT — SETELAH LEMBAR E</w:t>
             </w:r>
           </w:p>
         </w:tc>
@@ -14625,23 +13713,13 @@
             <w:pPr>
               <w:spacing w:after="0" w:line="240" w:lineRule="auto"/>
             </w:pPr>
-            <w:proofErr w:type="spellStart"/>
             <w:r>
               <w:rPr>
                 <w:rFonts w:ascii="DejaVu Sans Mono" w:eastAsia="DejaVu Sans Mono" w:hAnsi="DejaVu Sans Mono" w:cs="DejaVu Sans Mono"/>
                 <w:color w:val="E2E8F0"/>
                 <w:sz w:val="17"/>
               </w:rPr>
-              <w:t>npm</w:t>
-            </w:r>
-            <w:proofErr w:type="spellEnd"/>
-            <w:r>
-              <w:rPr>
-                <w:rFonts w:ascii="DejaVu Sans Mono" w:eastAsia="DejaVu Sans Mono" w:hAnsi="DejaVu Sans Mono" w:cs="DejaVu Sans Mono"/>
-                <w:color w:val="E2E8F0"/>
-                <w:sz w:val="17"/>
-              </w:rPr>
-              <w:t xml:space="preserve"> run build      # menghasilkan folder dist/</w:t>
+              <w:t>npm run build      # menghasilkan folder dist/</w:t>
             </w:r>
             <w:r>
               <w:br/>
@@ -15344,39 +14422,7 @@
                 <w:rFonts w:cs="Carlito"/>
                 <w:sz w:val="19"/>
               </w:rPr>
-              <w:t xml:space="preserve">Halaman jalan </w:t>
-            </w:r>
-            <w:proofErr w:type="spellStart"/>
-            <w:r>
-              <w:rPr>
-                <w:rFonts w:cs="Carlito"/>
-                <w:sz w:val="19"/>
-              </w:rPr>
-              <w:t>lewat</w:t>
-            </w:r>
-            <w:proofErr w:type="spellEnd"/>
-            <w:r>
-              <w:rPr>
-                <w:rFonts w:cs="Carlito"/>
-                <w:sz w:val="19"/>
-              </w:rPr>
-              <w:t xml:space="preserve"> </w:t>
-            </w:r>
-            <w:proofErr w:type="spellStart"/>
-            <w:r>
-              <w:rPr>
-                <w:rFonts w:cs="Carlito"/>
-                <w:sz w:val="19"/>
-              </w:rPr>
-              <w:t>npm</w:t>
-            </w:r>
-            <w:proofErr w:type="spellEnd"/>
-            <w:r>
-              <w:rPr>
-                <w:rFonts w:cs="Carlito"/>
-                <w:sz w:val="19"/>
-              </w:rPr>
-              <w:t xml:space="preserve"> run preview</w:t>
+              <w:t>Halaman jalan lewat npm run preview</w:t>
             </w:r>
           </w:p>
         </w:tc>
@@ -15738,33 +14784,8 @@
                 <w:rFonts w:cs="Carlito"/>
                 <w:sz w:val="18"/>
               </w:rPr>
-              <w:t xml:space="preserve">Cara </w:t>
-            </w:r>
-            <w:proofErr w:type="spellStart"/>
-            <w:r>
-              <w:rPr>
-                <w:rFonts w:cs="Carlito"/>
-                <w:sz w:val="18"/>
-              </w:rPr>
-              <w:t>mengukurnya</w:t>
-            </w:r>
-            <w:proofErr w:type="spellEnd"/>
-            <w:r>
-              <w:rPr>
-                <w:rFonts w:cs="Carlito"/>
-                <w:sz w:val="18"/>
-              </w:rPr>
-              <w:t xml:space="preserve"> di </w:t>
-            </w:r>
-            <w:proofErr w:type="spellStart"/>
-            <w:r>
-              <w:rPr>
-                <w:rFonts w:cs="Carlito"/>
-                <w:sz w:val="18"/>
-              </w:rPr>
-              <w:t>DevTools</w:t>
-            </w:r>
-            <w:proofErr w:type="spellEnd"/>
+              <w:t>Cara mengukurnya di DevTools</w:t>
+            </w:r>
           </w:p>
         </w:tc>
         <w:tc>
@@ -16006,23 +15027,7 @@
                 <w:rFonts w:cs="Carlito"/>
                 <w:sz w:val="18"/>
               </w:rPr>
-              <w:t xml:space="preserve">Jalan di Windows, </w:t>
-            </w:r>
-            <w:proofErr w:type="spellStart"/>
-            <w:r>
-              <w:rPr>
-                <w:rFonts w:cs="Carlito"/>
-                <w:sz w:val="18"/>
-              </w:rPr>
-              <w:t>gagal</w:t>
-            </w:r>
-            <w:proofErr w:type="spellEnd"/>
-            <w:r>
-              <w:rPr>
-                <w:rFonts w:cs="Carlito"/>
-                <w:sz w:val="18"/>
-              </w:rPr>
-              <w:t xml:space="preserve"> di Linux atau CI</w:t>
+              <w:t>Jalan di Windows, gagal di Linux atau CI</w:t>
             </w:r>
           </w:p>
         </w:tc>
@@ -16074,37 +15079,12 @@
             <w:pPr>
               <w:spacing w:before="20" w:after="20" w:line="252" w:lineRule="auto"/>
             </w:pPr>
-            <w:proofErr w:type="spellStart"/>
             <w:r>
               <w:rPr>
                 <w:rFonts w:cs="Carlito"/>
                 <w:sz w:val="18"/>
               </w:rPr>
-              <w:t>dist</w:t>
-            </w:r>
-            <w:proofErr w:type="spellEnd"/>
-            <w:r>
-              <w:rPr>
-                <w:rFonts w:cs="Carlito"/>
-                <w:sz w:val="18"/>
-              </w:rPr>
-              <w:t xml:space="preserve">/ </w:t>
-            </w:r>
-            <w:proofErr w:type="spellStart"/>
-            <w:r>
-              <w:rPr>
-                <w:rFonts w:cs="Carlito"/>
-                <w:sz w:val="18"/>
-              </w:rPr>
-              <w:t>ter</w:t>
-            </w:r>
-            <w:proofErr w:type="spellEnd"/>
-            <w:r>
-              <w:rPr>
-                <w:rFonts w:cs="Carlito"/>
-                <w:sz w:val="18"/>
-              </w:rPr>
-              <w:t>-commit</w:t>
+              <w:t>dist/ ter-commit</w:t>
             </w:r>
           </w:p>
         </w:tc>
@@ -16451,7 +15431,6 @@
             <w:pPr>
               <w:spacing w:after="0"/>
             </w:pPr>
-            <w:proofErr w:type="spellStart"/>
             <w:r>
               <w:rPr>
                 <w:rFonts w:cs="Carlito"/>
@@ -16459,57 +15438,7 @@
                 <w:color w:val="1B6B3A"/>
                 <w:sz w:val="20"/>
               </w:rPr>
-              <w:t>Simpan</w:t>
-            </w:r>
-            <w:proofErr w:type="spellEnd"/>
-            <w:r>
-              <w:rPr>
-                <w:rFonts w:cs="Carlito"/>
-                <w:b/>
-                <w:color w:val="1B6B3A"/>
-                <w:sz w:val="20"/>
-              </w:rPr>
-              <w:t xml:space="preserve"> </w:t>
-            </w:r>
-            <w:proofErr w:type="spellStart"/>
-            <w:r>
-              <w:rPr>
-                <w:rFonts w:cs="Carlito"/>
-                <w:b/>
-                <w:color w:val="1B6B3A"/>
-                <w:sz w:val="20"/>
-              </w:rPr>
-              <w:t>satu</w:t>
-            </w:r>
-            <w:proofErr w:type="spellEnd"/>
-            <w:r>
-              <w:rPr>
-                <w:rFonts w:cs="Carlito"/>
-                <w:b/>
-                <w:color w:val="1B6B3A"/>
-                <w:sz w:val="20"/>
-              </w:rPr>
-              <w:t xml:space="preserve"> </w:t>
-            </w:r>
-            <w:proofErr w:type="spellStart"/>
-            <w:r>
-              <w:rPr>
-                <w:rFonts w:cs="Carlito"/>
-                <w:b/>
-                <w:color w:val="1B6B3A"/>
-                <w:sz w:val="20"/>
-              </w:rPr>
-              <w:t>tangkapan</w:t>
-            </w:r>
-            <w:proofErr w:type="spellEnd"/>
-            <w:r>
-              <w:rPr>
-                <w:rFonts w:cs="Carlito"/>
-                <w:b/>
-                <w:color w:val="1B6B3A"/>
-                <w:sz w:val="20"/>
-              </w:rPr>
-              <w:t xml:space="preserve"> layar halaman yang jalan dari npm run preview.  Bukti itu yang Anda perlukan di lembar G, dan yang membuat pekerjaan Anda bisa diperiksa tanpa harus menjalankan terminal dosen.</w:t>
+              <w:t>Simpan satu tangkapan layar halaman yang jalan dari npm run preview.  Bukti itu yang Anda perlukan di lembar G, dan yang membuat pekerjaan Anda bisa diperiksa tanpa harus menjalankan terminal dosen.</w:t>
             </w:r>
           </w:p>
         </w:tc>
@@ -17514,69 +16443,13 @@
             <w:pPr>
               <w:spacing w:after="0"/>
             </w:pPr>
-            <w:proofErr w:type="gramStart"/>
             <w:r>
               <w:rPr>
                 <w:rFonts w:cs="Carlito"/>
                 <w:color w:val="003796"/>
                 <w:sz w:val="22"/>
               </w:rPr>
-              <w:t xml:space="preserve">☐  </w:t>
-            </w:r>
-            <w:proofErr w:type="spellStart"/>
-            <w:r>
-              <w:rPr>
-                <w:rFonts w:cs="Carlito"/>
-                <w:color w:val="003796"/>
-                <w:sz w:val="22"/>
-              </w:rPr>
-              <w:t>Keadaan</w:t>
-            </w:r>
-            <w:proofErr w:type="spellEnd"/>
-            <w:proofErr w:type="gramEnd"/>
-            <w:r>
-              <w:rPr>
-                <w:rFonts w:cs="Carlito"/>
-                <w:color w:val="003796"/>
-                <w:sz w:val="22"/>
-              </w:rPr>
-              <w:t xml:space="preserve">  state </w:t>
-            </w:r>
-            <w:proofErr w:type="spellStart"/>
-            <w:r>
-              <w:rPr>
-                <w:rFonts w:cs="Carlito"/>
-                <w:color w:val="003796"/>
-                <w:sz w:val="22"/>
-              </w:rPr>
-              <w:t>memakai</w:t>
-            </w:r>
-            <w:proofErr w:type="spellEnd"/>
-            <w:r>
-              <w:rPr>
-                <w:rFonts w:cs="Carlito"/>
-                <w:color w:val="003796"/>
-                <w:sz w:val="22"/>
-              </w:rPr>
-              <w:t xml:space="preserve"> </w:t>
-            </w:r>
-            <w:proofErr w:type="gramStart"/>
-            <w:r>
-              <w:rPr>
-                <w:rFonts w:cs="Carlito"/>
-                <w:color w:val="003796"/>
-                <w:sz w:val="22"/>
-              </w:rPr>
-              <w:t>reactive(</w:t>
-            </w:r>
-            <w:proofErr w:type="gramEnd"/>
-            <w:r>
-              <w:rPr>
-                <w:rFonts w:cs="Carlito"/>
-                <w:color w:val="003796"/>
-                <w:sz w:val="22"/>
-              </w:rPr>
-              <w:t>); tidak ada render(state) manual lagi</w:t>
+              <w:t>☐  Keadaan  state memakai reactive(); tidak ada render(state) manual lagi</w:t>
             </w:r>
           </w:p>
         </w:tc>
@@ -19238,37 +18111,12 @@
             <w:pPr>
               <w:spacing w:before="20" w:after="20" w:line="252" w:lineRule="auto"/>
             </w:pPr>
-            <w:proofErr w:type="spellStart"/>
             <w:r>
               <w:rPr>
                 <w:rFonts w:cs="Carlito"/>
                 <w:sz w:val="17"/>
               </w:rPr>
-              <w:t>Pemecahan</w:t>
-            </w:r>
-            <w:proofErr w:type="spellEnd"/>
-            <w:r>
-              <w:rPr>
-                <w:rFonts w:cs="Carlito"/>
-                <w:sz w:val="17"/>
-              </w:rPr>
-              <w:t xml:space="preserve"> </w:t>
-            </w:r>
-            <w:proofErr w:type="spellStart"/>
-            <w:r>
-              <w:rPr>
-                <w:rFonts w:cs="Carlito"/>
-                <w:sz w:val="17"/>
-              </w:rPr>
-              <w:t>komponen</w:t>
-            </w:r>
-            <w:proofErr w:type="spellEnd"/>
-            <w:r>
-              <w:rPr>
-                <w:rFonts w:cs="Carlito"/>
-                <w:sz w:val="17"/>
-              </w:rPr>
-              <w:t xml:space="preserve"> dan props</w:t>
+              <w:t>Pemecahan komponen dan props</w:t>
             </w:r>
           </w:p>
         </w:tc>
@@ -19402,23 +18250,7 @@
                 <w:rFonts w:cs="Carlito"/>
                 <w:sz w:val="17"/>
               </w:rPr>
-              <w:t xml:space="preserve">Build </w:t>
-            </w:r>
-            <w:proofErr w:type="spellStart"/>
-            <w:r>
-              <w:rPr>
-                <w:rFonts w:cs="Carlito"/>
-                <w:sz w:val="17"/>
-              </w:rPr>
-              <w:t>produksi</w:t>
-            </w:r>
-            <w:proofErr w:type="spellEnd"/>
-            <w:r>
-              <w:rPr>
-                <w:rFonts w:cs="Carlito"/>
-                <w:sz w:val="17"/>
-              </w:rPr>
-              <w:t xml:space="preserve"> dan preview</w:t>
+              <w:t>Build produksi dan preview</w:t>
             </w:r>
           </w:p>
         </w:tc>
@@ -19788,19 +18620,8 @@
                 <w:color w:val="FFFFFF"/>
                 <w:sz w:val="19"/>
               </w:rPr>
-              <w:t xml:space="preserve">Yang </w:t>
-            </w:r>
-            <w:proofErr w:type="spellStart"/>
-            <w:r>
-              <w:rPr>
-                <w:rFonts w:cs="Carlito"/>
-                <w:b/>
-                <w:color w:val="FFFFFF"/>
-                <w:sz w:val="19"/>
-              </w:rPr>
-              <w:t>dipakai</w:t>
-            </w:r>
-            <w:proofErr w:type="spellEnd"/>
+              <w:t>Yang dipakai</w:t>
+            </w:r>
           </w:p>
         </w:tc>
         <w:tc>
@@ -19952,21 +18773,12 @@
             <w:pPr>
               <w:spacing w:before="20" w:after="20" w:line="252" w:lineRule="auto"/>
             </w:pPr>
-            <w:proofErr w:type="spellStart"/>
             <w:r>
               <w:rPr>
                 <w:rFonts w:cs="Carlito"/>
                 <w:sz w:val="19"/>
               </w:rPr>
-              <w:t>npm</w:t>
-            </w:r>
-            <w:proofErr w:type="spellEnd"/>
-            <w:r>
-              <w:rPr>
-                <w:rFonts w:cs="Carlito"/>
-                <w:sz w:val="19"/>
-              </w:rPr>
-              <w:t xml:space="preserve"> install</w:t>
+              <w:t>npm install</w:t>
             </w:r>
           </w:p>
         </w:tc>
@@ -20382,21 +19194,12 @@
             <w:pPr>
               <w:spacing w:before="20" w:after="20" w:line="252" w:lineRule="auto"/>
             </w:pPr>
-            <w:proofErr w:type="gramStart"/>
             <w:r>
               <w:rPr>
                 <w:rFonts w:cs="Carlito"/>
                 <w:sz w:val="19"/>
               </w:rPr>
-              <w:t>reactive(</w:t>
-            </w:r>
-            <w:proofErr w:type="gramEnd"/>
-            <w:r>
-              <w:rPr>
-                <w:rFonts w:cs="Carlito"/>
-                <w:sz w:val="19"/>
-              </w:rPr>
-              <w:t>{ })</w:t>
+              <w:t>reactive({ })</w:t>
             </w:r>
           </w:p>
         </w:tc>
@@ -20827,7 +19630,6 @@
             <w:pPr>
               <w:spacing w:before="20" w:after="20" w:line="252" w:lineRule="auto"/>
             </w:pPr>
-            <w:proofErr w:type="spellStart"/>
             <w:r>
               <w:rPr>
                 <w:rFonts w:cs="Carlito"/>
@@ -20835,7 +19637,6 @@
               </w:rPr>
               <w:t>onMounted</w:t>
             </w:r>
-            <w:proofErr w:type="spellEnd"/>
           </w:p>
         </w:tc>
         <w:tc>
@@ -20969,7 +19770,6 @@
             <w:pPr>
               <w:spacing w:before="20" w:after="20"/>
             </w:pPr>
-            <w:proofErr w:type="spellStart"/>
             <w:r>
               <w:rPr>
                 <w:rFonts w:cs="Carlito"/>
@@ -20979,7 +19779,6 @@
               </w:rPr>
               <w:t>Gejala</w:t>
             </w:r>
-            <w:proofErr w:type="spellEnd"/>
           </w:p>
         </w:tc>
         <w:tc>
@@ -21105,53 +19904,12 @@
             <w:pPr>
               <w:spacing w:before="20" w:after="20" w:line="252" w:lineRule="auto"/>
             </w:pPr>
-            <w:proofErr w:type="spellStart"/>
             <w:r>
               <w:rPr>
                 <w:rFonts w:cs="Carlito"/>
                 <w:sz w:val="18"/>
               </w:rPr>
-              <w:t>Pilih</w:t>
-            </w:r>
-            <w:proofErr w:type="spellEnd"/>
-            <w:r>
-              <w:rPr>
-                <w:rFonts w:cs="Carlito"/>
-                <w:sz w:val="18"/>
-              </w:rPr>
-              <w:t xml:space="preserve"> Cancel, </w:t>
-            </w:r>
-            <w:proofErr w:type="spellStart"/>
-            <w:r>
-              <w:rPr>
-                <w:rFonts w:cs="Carlito"/>
-                <w:sz w:val="18"/>
-              </w:rPr>
-              <w:t>lalu</w:t>
-            </w:r>
-            <w:proofErr w:type="spellEnd"/>
-            <w:r>
-              <w:rPr>
-                <w:rFonts w:cs="Carlito"/>
-                <w:sz w:val="18"/>
-              </w:rPr>
-              <w:t xml:space="preserve"> </w:t>
-            </w:r>
-            <w:proofErr w:type="spellStart"/>
-            <w:r>
-              <w:rPr>
-                <w:rFonts w:cs="Carlito"/>
-                <w:sz w:val="18"/>
-              </w:rPr>
-              <w:t>buat</w:t>
-            </w:r>
-            <w:proofErr w:type="spellEnd"/>
-            <w:r>
-              <w:rPr>
-                <w:rFonts w:cs="Carlito"/>
-                <w:sz w:val="18"/>
-              </w:rPr>
-              <w:t xml:space="preserve"> folder baru yang kosong</w:t>
+              <w:t>Pilih Cancel, lalu buat folder baru yang kosong</w:t>
             </w:r>
           </w:p>
         </w:tc>
@@ -21261,33 +20019,8 @@
                 <w:rFonts w:cs="Carlito"/>
                 <w:sz w:val="18"/>
               </w:rPr>
-              <w:t xml:space="preserve">Halaman polos </w:t>
-            </w:r>
-            <w:proofErr w:type="spellStart"/>
-            <w:r>
-              <w:rPr>
-                <w:rFonts w:cs="Carlito"/>
-                <w:sz w:val="18"/>
-              </w:rPr>
-              <w:t>tanpa</w:t>
-            </w:r>
-            <w:proofErr w:type="spellEnd"/>
-            <w:r>
-              <w:rPr>
-                <w:rFonts w:cs="Carlito"/>
-                <w:sz w:val="18"/>
-              </w:rPr>
-              <w:t xml:space="preserve"> </w:t>
-            </w:r>
-            <w:proofErr w:type="spellStart"/>
-            <w:r>
-              <w:rPr>
-                <w:rFonts w:cs="Carlito"/>
-                <w:sz w:val="18"/>
-              </w:rPr>
-              <w:t>warna</w:t>
-            </w:r>
-            <w:proofErr w:type="spellEnd"/>
+              <w:t>Halaman polos tanpa warna</w:t>
+            </w:r>
           </w:p>
         </w:tc>
         <w:tc>
@@ -21526,49 +20259,8 @@
                 <w:rFonts w:cs="Carlito"/>
                 <w:sz w:val="18"/>
               </w:rPr>
-              <w:t xml:space="preserve">props </w:t>
-            </w:r>
-            <w:proofErr w:type="spellStart"/>
-            <w:r>
-              <w:rPr>
-                <w:rFonts w:cs="Carlito"/>
-                <w:sz w:val="18"/>
-              </w:rPr>
-              <w:t>tidak</w:t>
-            </w:r>
-            <w:proofErr w:type="spellEnd"/>
-            <w:r>
-              <w:rPr>
-                <w:rFonts w:cs="Carlito"/>
-                <w:sz w:val="18"/>
-              </w:rPr>
-              <w:t xml:space="preserve"> </w:t>
-            </w:r>
-            <w:proofErr w:type="spellStart"/>
-            <w:r>
-              <w:rPr>
-                <w:rFonts w:cs="Carlito"/>
-                <w:sz w:val="18"/>
-              </w:rPr>
-              <w:t>muncul</w:t>
-            </w:r>
-            <w:proofErr w:type="spellEnd"/>
-            <w:r>
-              <w:rPr>
-                <w:rFonts w:cs="Carlito"/>
-                <w:sz w:val="18"/>
-              </w:rPr>
-              <w:t xml:space="preserve"> </w:t>
-            </w:r>
-            <w:proofErr w:type="spellStart"/>
-            <w:r>
-              <w:rPr>
-                <w:rFonts w:cs="Carlito"/>
-                <w:sz w:val="18"/>
-              </w:rPr>
-              <w:t>isinya</w:t>
-            </w:r>
-            <w:proofErr w:type="spellEnd"/>
+              <w:t>props tidak muncul isinya</w:t>
+            </w:r>
           </w:p>
         </w:tc>
         <w:tc>
@@ -21670,33 +20362,8 @@
                 <w:rFonts w:cs="Carlito"/>
                 <w:sz w:val="18"/>
               </w:rPr>
-              <w:t xml:space="preserve">:key </w:t>
-            </w:r>
-            <w:proofErr w:type="spellStart"/>
-            <w:r>
-              <w:rPr>
-                <w:rFonts w:cs="Carlito"/>
-                <w:sz w:val="18"/>
-              </w:rPr>
-              <w:t>belum</w:t>
-            </w:r>
-            <w:proofErr w:type="spellEnd"/>
-            <w:r>
-              <w:rPr>
-                <w:rFonts w:cs="Carlito"/>
-                <w:sz w:val="18"/>
-              </w:rPr>
-              <w:t xml:space="preserve"> </w:t>
-            </w:r>
-            <w:proofErr w:type="spellStart"/>
-            <w:r>
-              <w:rPr>
-                <w:rFonts w:cs="Carlito"/>
-                <w:sz w:val="18"/>
-              </w:rPr>
-              <w:t>dipasang</w:t>
-            </w:r>
-            <w:proofErr w:type="spellEnd"/>
+              <w:t>:key belum dipasang</w:t>
+            </w:r>
           </w:p>
         </w:tc>
         <w:tc>
@@ -21874,55 +20541,7 @@
                 <w:rFonts w:cs="Carlito"/>
                 <w:sz w:val="18"/>
               </w:rPr>
-              <w:t xml:space="preserve">Pakai </w:t>
-            </w:r>
-            <w:proofErr w:type="spellStart"/>
-            <w:r>
-              <w:rPr>
-                <w:rFonts w:cs="Carlito"/>
-                <w:sz w:val="18"/>
-              </w:rPr>
-              <w:t>satu</w:t>
-            </w:r>
-            <w:proofErr w:type="spellEnd"/>
-            <w:r>
-              <w:rPr>
-                <w:rFonts w:cs="Carlito"/>
-                <w:sz w:val="18"/>
-              </w:rPr>
-              <w:t xml:space="preserve"> </w:t>
-            </w:r>
-            <w:proofErr w:type="spellStart"/>
-            <w:r>
-              <w:rPr>
-                <w:rFonts w:cs="Carlito"/>
-                <w:sz w:val="18"/>
-              </w:rPr>
-              <w:t>kunci</w:t>
-            </w:r>
-            <w:proofErr w:type="spellEnd"/>
-            <w:r>
-              <w:rPr>
-                <w:rFonts w:cs="Carlito"/>
-                <w:sz w:val="18"/>
-              </w:rPr>
-              <w:t xml:space="preserve"> </w:t>
-            </w:r>
-            <w:proofErr w:type="spellStart"/>
-            <w:r>
-              <w:rPr>
-                <w:rFonts w:cs="Carlito"/>
-                <w:sz w:val="18"/>
-              </w:rPr>
-              <w:t>tetap</w:t>
-            </w:r>
-            <w:proofErr w:type="spellEnd"/>
-            <w:r>
-              <w:rPr>
-                <w:rFonts w:cs="Carlito"/>
-                <w:sz w:val="18"/>
-              </w:rPr>
-              <w:t xml:space="preserve"> dan catat nomor portnya</w:t>
+              <w:t>Pakai satu kunci tetap dan catat nomor portnya</w:t>
             </w:r>
           </w:p>
         </w:tc>
@@ -22416,23 +21035,7 @@
                 <w:rFonts w:cs="Carlito"/>
                 <w:sz w:val="18"/>
               </w:rPr>
-              <w:t xml:space="preserve">Setiap kali selesai </w:t>
-            </w:r>
-            <w:proofErr w:type="spellStart"/>
-            <w:r>
-              <w:rPr>
-                <w:rFonts w:cs="Carlito"/>
-                <w:sz w:val="18"/>
-              </w:rPr>
-              <w:t>satu</w:t>
-            </w:r>
-            <w:proofErr w:type="spellEnd"/>
-            <w:r>
-              <w:rPr>
-                <w:rFonts w:cs="Carlito"/>
-                <w:sz w:val="18"/>
-              </w:rPr>
-              <w:t xml:space="preserve"> lembar</w:t>
+              <w:t>Setiap kali selesai satu lembar</w:t>
             </w:r>
           </w:p>
         </w:tc>
@@ -22630,7 +21233,6 @@
               </w:rPr>
               <w:t xml:space="preserve">Titik pada git add .  Titik itu berarti "seluruh berkas di folder ini".  </w:t>
             </w:r>
-            <w:proofErr w:type="spellStart"/>
             <w:r>
               <w:rPr>
                 <w:rFonts w:cs="Carlito"/>
@@ -22638,57 +21240,7 @@
                 <w:color w:val="003796"/>
                 <w:sz w:val="20"/>
               </w:rPr>
-              <w:t>Berkat</w:t>
-            </w:r>
-            <w:proofErr w:type="spellEnd"/>
-            <w:r>
-              <w:rPr>
-                <w:rFonts w:cs="Carlito"/>
-                <w:b/>
-                <w:color w:val="003796"/>
-                <w:sz w:val="20"/>
-              </w:rPr>
-              <w:t xml:space="preserve"> .</w:t>
-            </w:r>
-            <w:proofErr w:type="spellStart"/>
-            <w:r>
-              <w:rPr>
-                <w:rFonts w:cs="Carlito"/>
-                <w:b/>
-                <w:color w:val="003796"/>
-                <w:sz w:val="20"/>
-              </w:rPr>
-              <w:t>gitignore</w:t>
-            </w:r>
-            <w:proofErr w:type="spellEnd"/>
-            <w:r>
-              <w:rPr>
-                <w:rFonts w:cs="Carlito"/>
-                <w:b/>
-                <w:color w:val="003796"/>
-                <w:sz w:val="20"/>
-              </w:rPr>
-              <w:t xml:space="preserve">, </w:t>
-            </w:r>
-            <w:proofErr w:type="spellStart"/>
-            <w:r>
-              <w:rPr>
-                <w:rFonts w:cs="Carlito"/>
-                <w:b/>
-                <w:color w:val="003796"/>
-                <w:sz w:val="20"/>
-              </w:rPr>
-              <w:t>node_modules</w:t>
-            </w:r>
-            <w:proofErr w:type="spellEnd"/>
-            <w:r>
-              <w:rPr>
-                <w:rFonts w:cs="Carlito"/>
-                <w:b/>
-                <w:color w:val="003796"/>
-                <w:sz w:val="20"/>
-              </w:rPr>
-              <w:t>/ dan dist/ tidak ikut meskipun titik itu dipakai.</w:t>
+              <w:t>Berkat .gitignore, node_modules/ dan dist/ tidak ikut meskipun titik itu dipakai.</w:t>
             </w:r>
           </w:p>
         </w:tc>
@@ -22774,19 +21326,8 @@
                 <w:color w:val="FFFFFF"/>
                 <w:sz w:val="19"/>
               </w:rPr>
-              <w:t xml:space="preserve">Kalau ini </w:t>
-            </w:r>
-            <w:proofErr w:type="spellStart"/>
-            <w:r>
-              <w:rPr>
-                <w:rFonts w:cs="Carlito"/>
-                <w:b/>
-                <w:color w:val="FFFFFF"/>
-                <w:sz w:val="19"/>
-              </w:rPr>
-              <w:t>terjadi</w:t>
-            </w:r>
-            <w:proofErr w:type="spellEnd"/>
+              <w:t>Kalau ini terjadi</w:t>
+            </w:r>
           </w:p>
         </w:tc>
         <w:tc>
@@ -23131,115 +21672,7 @@
         <w:color w:val="5A6080"/>
         <w:sz w:val="15"/>
       </w:rPr>
-      <w:t>PABW 2026/</w:t>
-    </w:r>
-    <w:proofErr w:type="gramStart"/>
-    <w:r>
-      <w:rPr>
-        <w:rFonts w:cs="Carlito"/>
-        <w:color w:val="5A6080"/>
-        <w:sz w:val="15"/>
-      </w:rPr>
-      <w:t>2027  ·</w:t>
-    </w:r>
-    <w:proofErr w:type="gramEnd"/>
-    <w:r>
-      <w:rPr>
-        <w:rFonts w:cs="Carlito"/>
-        <w:color w:val="5A6080"/>
-        <w:sz w:val="15"/>
-      </w:rPr>
-      <w:t xml:space="preserve">  </w:t>
-    </w:r>
-    <w:proofErr w:type="spellStart"/>
-    <w:r>
-      <w:rPr>
-        <w:rFonts w:cs="Carlito"/>
-        <w:color w:val="5A6080"/>
-        <w:sz w:val="15"/>
-      </w:rPr>
-      <w:t>Pertemuan</w:t>
-    </w:r>
-    <w:proofErr w:type="spellEnd"/>
-    <w:r>
-      <w:rPr>
-        <w:rFonts w:cs="Carlito"/>
-        <w:color w:val="5A6080"/>
-        <w:sz w:val="15"/>
-      </w:rPr>
-      <w:t xml:space="preserve"> </w:t>
-    </w:r>
-    <w:proofErr w:type="gramStart"/>
-    <w:r>
-      <w:rPr>
-        <w:rFonts w:cs="Carlito"/>
-        <w:color w:val="5A6080"/>
-        <w:sz w:val="15"/>
-      </w:rPr>
-      <w:t>12  ·</w:t>
-    </w:r>
-    <w:proofErr w:type="gramEnd"/>
-    <w:r>
-      <w:rPr>
-        <w:rFonts w:cs="Carlito"/>
-        <w:color w:val="5A6080"/>
-        <w:sz w:val="15"/>
-      </w:rPr>
-      <w:t xml:space="preserve">  Build Tooling, </w:t>
-    </w:r>
-    <w:proofErr w:type="spellStart"/>
-    <w:r>
-      <w:rPr>
-        <w:rFonts w:cs="Carlito"/>
-        <w:color w:val="5A6080"/>
-        <w:sz w:val="15"/>
-      </w:rPr>
-      <w:t>npm</w:t>
-    </w:r>
-    <w:proofErr w:type="spellEnd"/>
-    <w:r>
-      <w:rPr>
-        <w:rFonts w:cs="Carlito"/>
-        <w:color w:val="5A6080"/>
-        <w:sz w:val="15"/>
-      </w:rPr>
-      <w:t xml:space="preserve">, dan Framework </w:t>
-    </w:r>
-    <w:proofErr w:type="gramStart"/>
-    <w:r>
-      <w:rPr>
-        <w:rFonts w:cs="Carlito"/>
-        <w:color w:val="5A6080"/>
-        <w:sz w:val="15"/>
-      </w:rPr>
-      <w:t>SPA  ·</w:t>
-    </w:r>
-    <w:proofErr w:type="gramEnd"/>
-    <w:r>
-      <w:rPr>
-        <w:rFonts w:cs="Carlito"/>
-        <w:color w:val="5A6080"/>
-        <w:sz w:val="15"/>
-      </w:rPr>
-      <w:t xml:space="preserve">  Universitas Islam </w:t>
-    </w:r>
-    <w:proofErr w:type="gramStart"/>
-    <w:r>
-      <w:rPr>
-        <w:rFonts w:cs="Carlito"/>
-        <w:color w:val="5A6080"/>
-        <w:sz w:val="15"/>
-      </w:rPr>
-      <w:t>Indonesia  ·</w:t>
-    </w:r>
-    <w:proofErr w:type="gramEnd"/>
-    <w:r>
-      <w:rPr>
-        <w:rFonts w:cs="Carlito"/>
-        <w:color w:val="5A6080"/>
-        <w:sz w:val="15"/>
-      </w:rPr>
-      <w:t xml:space="preserve">  halaman</w:t>
+      <w:t>PABW 2026/2027  ·  Pertemuan 12  ·  Build Tooling, npm, dan Framework SPA  ·  Universitas Islam Indonesia  ·  halaman</w:t>
     </w:r>
     <w:r>
       <w:fldChar w:fldCharType="begin"/>

</xml_diff>

<commit_message>
P12 — empat komponen tersusun
</commit_message>
<xml_diff>
--- a/12. Worksheet_PABW_Pertemuan12 - ID (revisi sinkron).docx
+++ b/12. Worksheet_PABW_Pertemuan12 - ID (revisi sinkron).docx
@@ -10376,6 +10376,12 @@
                 <w:lang w:val="de-DE"/>
               </w:rPr>
             </w:pPr>
+            <w:r>
+              <w:rPr>
+                <w:lang w:val="de-DE"/>
+              </w:rPr>
+              <w:t>Sesuai</w:t>
+            </w:r>
           </w:p>
         </w:tc>
       </w:tr>
@@ -10452,6 +10458,12 @@
                 <w:lang w:val="de-DE"/>
               </w:rPr>
             </w:pPr>
+            <w:r>
+              <w:rPr>
+                <w:lang w:val="de-DE"/>
+              </w:rPr>
+              <w:t>Sesuai</w:t>
+            </w:r>
           </w:p>
         </w:tc>
       </w:tr>
@@ -10522,6 +10534,9 @@
             <w:pPr>
               <w:spacing w:before="20" w:after="20" w:line="252" w:lineRule="auto"/>
             </w:pPr>
+            <w:r>
+              <w:t>Sesuai</w:t>
+            </w:r>
           </w:p>
         </w:tc>
       </w:tr>
@@ -10591,6 +10606,9 @@
             <w:pPr>
               <w:spacing w:before="20" w:after="20" w:line="252" w:lineRule="auto"/>
             </w:pPr>
+            <w:r>
+              <w:t>Sesuai</w:t>
+            </w:r>
           </w:p>
         </w:tc>
       </w:tr>
@@ -10660,6 +10678,9 @@
             <w:pPr>
               <w:spacing w:before="20" w:after="20" w:line="252" w:lineRule="auto"/>
             </w:pPr>
+            <w:r>
+              <w:t>Sesuai</w:t>
+            </w:r>
           </w:p>
         </w:tc>
       </w:tr>
@@ -10876,7 +10897,18 @@
           <w:p>
             <w:pPr>
               <w:spacing w:before="20" w:after="20" w:line="252" w:lineRule="auto"/>
-            </w:pPr>
+              <w:rPr>
+                <w:sz w:val="18"/>
+                <w:szCs w:val="18"/>
+              </w:rPr>
+            </w:pPr>
+            <w:r>
+              <w:rPr>
+                <w:sz w:val="18"/>
+                <w:szCs w:val="18"/>
+              </w:rPr>
+              <w:t>App.vue</w:t>
+            </w:r>
           </w:p>
         </w:tc>
         <w:tc>
@@ -10892,7 +10924,18 @@
           <w:p>
             <w:pPr>
               <w:spacing w:before="20" w:after="20" w:line="252" w:lineRule="auto"/>
-            </w:pPr>
+              <w:rPr>
+                <w:sz w:val="18"/>
+                <w:szCs w:val="18"/>
+              </w:rPr>
+            </w:pPr>
+            <w:r>
+              <w:rPr>
+                <w:sz w:val="18"/>
+                <w:szCs w:val="18"/>
+              </w:rPr>
+              <w:t>Ya (profil)</w:t>
+            </w:r>
           </w:p>
         </w:tc>
       </w:tr>
@@ -10938,7 +10981,19 @@
           <w:p>
             <w:pPr>
               <w:spacing w:before="20" w:after="20" w:line="252" w:lineRule="auto"/>
-            </w:pPr>
+              <w:rPr>
+                <w:sz w:val="18"/>
+                <w:szCs w:val="18"/>
+              </w:rPr>
+            </w:pPr>
+            <w:r>
+              <w:rPr>
+                <w:rFonts w:cs="Carlito"/>
+                <w:sz w:val="18"/>
+                <w:szCs w:val="18"/>
+              </w:rPr>
+              <w:t>DaftarProyek.vue</w:t>
+            </w:r>
           </w:p>
         </w:tc>
         <w:tc>
@@ -10954,7 +11009,18 @@
           <w:p>
             <w:pPr>
               <w:spacing w:before="20" w:after="20" w:line="252" w:lineRule="auto"/>
-            </w:pPr>
+              <w:rPr>
+                <w:sz w:val="18"/>
+                <w:szCs w:val="18"/>
+              </w:rPr>
+            </w:pPr>
+            <w:r>
+              <w:rPr>
+                <w:sz w:val="18"/>
+                <w:szCs w:val="18"/>
+              </w:rPr>
+              <w:t>Tidak</w:t>
+            </w:r>
           </w:p>
         </w:tc>
       </w:tr>
@@ -11000,7 +11066,18 @@
           <w:p>
             <w:pPr>
               <w:spacing w:before="20" w:after="20" w:line="252" w:lineRule="auto"/>
-            </w:pPr>
+              <w:rPr>
+                <w:sz w:val="18"/>
+                <w:szCs w:val="18"/>
+              </w:rPr>
+            </w:pPr>
+            <w:r>
+              <w:rPr>
+                <w:sz w:val="18"/>
+                <w:szCs w:val="18"/>
+              </w:rPr>
+              <w:t>App.vue</w:t>
+            </w:r>
           </w:p>
         </w:tc>
         <w:tc>
@@ -11016,7 +11093,18 @@
           <w:p>
             <w:pPr>
               <w:spacing w:before="20" w:after="20" w:line="252" w:lineRule="auto"/>
-            </w:pPr>
+              <w:rPr>
+                <w:sz w:val="18"/>
+                <w:szCs w:val="18"/>
+              </w:rPr>
+            </w:pPr>
+            <w:r>
+              <w:rPr>
+                <w:sz w:val="18"/>
+                <w:szCs w:val="18"/>
+              </w:rPr>
+              <w:t>Tidak</w:t>
+            </w:r>
           </w:p>
         </w:tc>
       </w:tr>
@@ -11062,7 +11150,18 @@
           <w:p>
             <w:pPr>
               <w:spacing w:before="20" w:after="20" w:line="252" w:lineRule="auto"/>
-            </w:pPr>
+              <w:rPr>
+                <w:sz w:val="18"/>
+                <w:szCs w:val="18"/>
+              </w:rPr>
+            </w:pPr>
+            <w:r>
+              <w:rPr>
+                <w:sz w:val="18"/>
+                <w:szCs w:val="18"/>
+              </w:rPr>
+              <w:t>App.vue</w:t>
+            </w:r>
           </w:p>
         </w:tc>
         <w:tc>
@@ -11078,7 +11177,18 @@
           <w:p>
             <w:pPr>
               <w:spacing w:before="20" w:after="20" w:line="252" w:lineRule="auto"/>
-            </w:pPr>
+              <w:rPr>
+                <w:sz w:val="18"/>
+                <w:szCs w:val="18"/>
+              </w:rPr>
+            </w:pPr>
+            <w:r>
+              <w:rPr>
+                <w:sz w:val="18"/>
+                <w:szCs w:val="18"/>
+              </w:rPr>
+              <w:t>Tidak</w:t>
+            </w:r>
           </w:p>
         </w:tc>
       </w:tr>

</xml_diff>

<commit_message>
P12 — build produksi berhasil
</commit_message>
<xml_diff>
--- a/12. Worksheet_PABW_Pertemuan12 - ID (revisi sinkron).docx
+++ b/12. Worksheet_PABW_Pertemuan12 - ID (revisi sinkron).docx
@@ -12722,6 +12722,9 @@
             <w:pPr>
               <w:spacing w:before="20" w:after="20" w:line="252" w:lineRule="auto"/>
             </w:pPr>
+            <w:r>
+              <w:t>Sesuai</w:t>
+            </w:r>
           </w:p>
         </w:tc>
       </w:tr>
@@ -12795,6 +12798,9 @@
             <w:pPr>
               <w:spacing w:before="20" w:after="20" w:line="252" w:lineRule="auto"/>
             </w:pPr>
+            <w:r>
+              <w:t>Sesuai</w:t>
+            </w:r>
           </w:p>
         </w:tc>
       </w:tr>
@@ -12864,6 +12870,9 @@
             <w:pPr>
               <w:spacing w:before="20" w:after="20" w:line="252" w:lineRule="auto"/>
             </w:pPr>
+            <w:r>
+              <w:t>Sesuai</w:t>
+            </w:r>
           </w:p>
         </w:tc>
       </w:tr>
@@ -12933,6 +12942,9 @@
             <w:pPr>
               <w:spacing w:before="20" w:after="20" w:line="252" w:lineRule="auto"/>
             </w:pPr>
+            <w:r>
+              <w:t>Sesuai</w:t>
+            </w:r>
           </w:p>
         </w:tc>
       </w:tr>
@@ -13002,6 +13014,9 @@
             <w:pPr>
               <w:spacing w:before="20" w:after="20" w:line="252" w:lineRule="auto"/>
             </w:pPr>
+            <w:r>
+              <w:t>Sesuai</w:t>
+            </w:r>
           </w:p>
         </w:tc>
       </w:tr>
@@ -13210,6 +13225,12 @@
                 <w:lang w:val="de-DE"/>
               </w:rPr>
             </w:pPr>
+            <w:r>
+              <w:rPr>
+                <w:lang w:val="de-DE"/>
+              </w:rPr>
+              <w:t>Sesuai</w:t>
+            </w:r>
           </w:p>
         </w:tc>
       </w:tr>
@@ -13283,6 +13304,9 @@
             <w:pPr>
               <w:spacing w:before="20" w:after="20" w:line="252" w:lineRule="auto"/>
             </w:pPr>
+            <w:r>
+              <w:t>Sesuai</w:t>
+            </w:r>
           </w:p>
         </w:tc>
       </w:tr>
@@ -13359,6 +13383,12 @@
                 <w:lang w:val="de-DE"/>
               </w:rPr>
             </w:pPr>
+            <w:r>
+              <w:rPr>
+                <w:lang w:val="de-DE"/>
+              </w:rPr>
+              <w:t>Sesuai</w:t>
+            </w:r>
           </w:p>
         </w:tc>
       </w:tr>
@@ -14352,6 +14382,9 @@
             <w:pPr>
               <w:spacing w:before="20" w:after="20" w:line="252" w:lineRule="auto"/>
             </w:pPr>
+            <w:r>
+              <w:t>Sesuai</w:t>
+            </w:r>
           </w:p>
         </w:tc>
       </w:tr>
@@ -14398,6 +14431,9 @@
             <w:pPr>
               <w:spacing w:before="20" w:after="20" w:line="252" w:lineRule="auto"/>
             </w:pPr>
+            <w:r>
+              <w:t>Sesuai</w:t>
+            </w:r>
           </w:p>
         </w:tc>
       </w:tr>
@@ -14451,6 +14487,9 @@
                 <w:lang w:val="de-DE"/>
               </w:rPr>
             </w:pPr>
+            <w:r>
+              <w:t>Sesuai</w:t>
+            </w:r>
           </w:p>
         </w:tc>
       </w:tr>
@@ -14504,6 +14543,9 @@
                 <w:lang w:val="de-DE"/>
               </w:rPr>
             </w:pPr>
+            <w:r>
+              <w:t>Sesuai</w:t>
+            </w:r>
           </w:p>
         </w:tc>
       </w:tr>
@@ -14550,6 +14592,9 @@
             <w:pPr>
               <w:spacing w:before="20" w:after="20" w:line="252" w:lineRule="auto"/>
             </w:pPr>
+            <w:r>
+              <w:t>Sesuai</w:t>
+            </w:r>
           </w:p>
         </w:tc>
       </w:tr>
@@ -14596,6 +14641,9 @@
             <w:pPr>
               <w:spacing w:before="20" w:after="20" w:line="252" w:lineRule="auto"/>
             </w:pPr>
+            <w:r>
+              <w:t>Sesuai</w:t>
+            </w:r>
           </w:p>
         </w:tc>
       </w:tr>
@@ -14775,6 +14823,12 @@
                 <w:lang w:val="de-DE"/>
               </w:rPr>
             </w:pPr>
+            <w:r>
+              <w:rPr>
+                <w:lang w:val="de-DE"/>
+              </w:rPr>
+              <w:t>1.5MB</w:t>
+            </w:r>
           </w:p>
         </w:tc>
         <w:tc>
@@ -14794,6 +14848,12 @@
                 <w:lang w:val="de-DE"/>
               </w:rPr>
             </w:pPr>
+            <w:r>
+              <w:rPr>
+                <w:lang w:val="de-DE"/>
+              </w:rPr>
+              <w:t>32.4KB</w:t>
+            </w:r>
           </w:p>
         </w:tc>
       </w:tr>
@@ -14847,6 +14907,12 @@
                 <w:lang w:val="de-DE"/>
               </w:rPr>
             </w:pPr>
+            <w:r>
+              <w:rPr>
+                <w:lang w:val="de-DE"/>
+              </w:rPr>
+              <w:t>26</w:t>
+            </w:r>
           </w:p>
         </w:tc>
         <w:tc>
@@ -14866,6 +14932,12 @@
                 <w:lang w:val="de-DE"/>
               </w:rPr>
             </w:pPr>
+            <w:r>
+              <w:rPr>
+                <w:lang w:val="de-DE"/>
+              </w:rPr>
+              <w:t>7</w:t>
+            </w:r>
           </w:p>
         </w:tc>
       </w:tr>
@@ -15431,6 +15503,9 @@
             <w:pPr>
               <w:spacing w:before="20" w:after="20" w:line="252" w:lineRule="auto"/>
             </w:pPr>
+            <w:r>
+              <w:t>dist/</w:t>
+            </w:r>
           </w:p>
         </w:tc>
         <w:tc>
@@ -15477,6 +15552,9 @@
             <w:pPr>
               <w:spacing w:before="20" w:after="20" w:line="252" w:lineRule="auto"/>
             </w:pPr>
+            <w:r>
+              <w:t>node_modules/</w:t>
+            </w:r>
           </w:p>
         </w:tc>
         <w:tc>
@@ -17413,7 +17491,42 @@
           <w:rFonts w:cs="Carlito"/>
           <w:sz w:val="20"/>
         </w:rPr>
-        <w:t>Tanda tangan: ______________________________     Tanggal: ______________     Jam selesai: __________</w:t>
+        <w:t xml:space="preserve">Tanda tangan: </w:t>
+      </w:r>
+      <w:r>
+        <w:rPr>
+          <w:rFonts w:cs="Carlito"/>
+          <w:sz w:val="20"/>
+        </w:rPr>
+        <w:t>Muhamad Raynard Alif</w:t>
+      </w:r>
+      <w:r>
+        <w:rPr>
+          <w:rFonts w:cs="Carlito"/>
+          <w:sz w:val="20"/>
+        </w:rPr>
+        <w:t xml:space="preserve">    Tanggal: </w:t>
+      </w:r>
+      <w:r>
+        <w:rPr>
+          <w:rFonts w:cs="Carlito"/>
+          <w:sz w:val="20"/>
+        </w:rPr>
+        <w:t>22/10/2026</w:t>
+      </w:r>
+      <w:r>
+        <w:rPr>
+          <w:rFonts w:cs="Carlito"/>
+          <w:sz w:val="20"/>
+        </w:rPr>
+        <w:t xml:space="preserve">     Jam selesai: </w:t>
+      </w:r>
+      <w:r>
+        <w:rPr>
+          <w:rFonts w:cs="Carlito"/>
+          <w:sz w:val="20"/>
+        </w:rPr>
+        <w:t>23.41</w:t>
       </w:r>
     </w:p>
     <w:p>

</xml_diff>